<commit_message>
Enhanced casing in query and updated the report
</commit_message>
<xml_diff>
--- a/Customer Shopping Behavior Analysis.docx
+++ b/Customer Shopping Behavior Analysis.docx
@@ -20,6 +20,27 @@
     </w:p>
     <w:p>
       <w:pPr>
+        <w:ind w:left="576"/>
+      </w:pPr>
+      <w:r>
+        <w:t xml:space="preserve">This project will help the leading retail company to understand their behavior on their shopping habits on a regular basis so that they can act according to the desires of the consumer and analyzing </w:t>
+      </w:r>
+      <w:r>
+        <w:t xml:space="preserve">which factors, such as discounts, reviews, seasons, or payment preferences, drive consumer decisions and repeat purchases. </w:t>
+      </w:r>
+      <w:r>
+        <w:t>The main motive of this analysis is to leverage customers’ shopping data and search for the trends and patterns  to improve customer engagement.</w:t>
+      </w:r>
+    </w:p>
+    <w:p>
+      <w:r>
+        <w:pict w14:anchorId="02851D0A">
+          <v:rect id="_x0000_i1025" style="width:0;height:1.5pt" o:hralign="center" o:hrstd="t" o:hr="t" fillcolor="#a0a0a0" stroked="f"/>
+        </w:pict>
+      </w:r>
+    </w:p>
+    <w:p>
+      <w:pPr>
         <w:pStyle w:val="Heading2"/>
       </w:pPr>
       <w:r>
@@ -27,6 +48,9 @@
       </w:r>
     </w:p>
     <w:p>
+      <w:pPr>
+        <w:ind w:left="576"/>
+      </w:pPr>
       <w:r>
         <w:t xml:space="preserve">This report documents the end-to-end data cleaning, feature engineering, and database integration process performed on the </w:t>
       </w:r>
@@ -44,7 +68,7 @@
     <w:p>
       <w:r>
         <w:pict w14:anchorId="2217507E">
-          <v:rect id="_x0000_i1025" style="width:0;height:1.5pt" o:hralign="center" o:hrstd="t" o:hr="t" fillcolor="#a0a0a0" stroked="f"/>
+          <v:rect id="_x0000_i1026" style="width:0;height:1.5pt" o:hralign="center" o:hrstd="t" o:hr="t" fillcolor="#a0a0a0" stroked="f"/>
         </w:pict>
       </w:r>
     </w:p>
@@ -58,15 +82,7 @@
     </w:p>
     <w:p>
       <w:r>
-        <w:t xml:space="preserve">The raw dataset was loaded into a Pandas </w:t>
-      </w:r>
-      <w:proofErr w:type="spellStart"/>
-      <w:r>
-        <w:t>DataFrame</w:t>
-      </w:r>
-      <w:proofErr w:type="spellEnd"/>
-      <w:r>
-        <w:t xml:space="preserve"> from customer_shopping_behavior.csv containing 3,900 customer records and 18 initial variables.</w:t>
+        <w:t>The raw dataset was loaded into a Pandas DataFrame from customer_shopping_behavior.csv containing 3,900 customer records and 18 initial variables.</w:t>
       </w:r>
     </w:p>
     <w:p>
@@ -108,7 +124,7 @@
     <w:p>
       <w:r>
         <w:pict w14:anchorId="7377BAE7">
-          <v:rect id="_x0000_i1026" style="width:0;height:1.5pt" o:hralign="center" o:hrstd="t" o:hr="t" fillcolor="#a0a0a0" stroked="f"/>
+          <v:rect id="_x0000_i1027" style="width:0;height:1.5pt" o:hralign="center" o:hrstd="t" o:hr="t" fillcolor="#a0a0a0" stroked="f"/>
         </w:pict>
       </w:r>
     </w:p>
@@ -147,106 +163,155 @@
           <w:b/>
           <w:bCs/>
         </w:rPr>
-        <w:t>Step 3.1: Missing Value Assessment &amp; Category-Based Imputation</w:t>
-      </w:r>
-    </w:p>
-    <w:p>
-      <w:r>
-        <w:t>An initial missing-value check identified 37 missing values in the Review Rating column, while all other columns had full coverage.</w:t>
-      </w:r>
-    </w:p>
-    <w:p>
-      <w:r>
-        <w:t>Python</w:t>
-      </w:r>
-    </w:p>
-    <w:p>
-      <w:r>
-        <w:t># Missing value check output</w:t>
-      </w:r>
-    </w:p>
-    <w:p>
-      <w:r>
-        <w:t>Review Rating: 37 missing values</w:t>
-      </w:r>
-    </w:p>
-    <w:p>
-      <w:r>
-        <w:t>All other attributes: 0 missing values</w:t>
-      </w:r>
-    </w:p>
-    <w:p>
-      <w:r>
+        <w:t>Step 1: Missing Value Assessment &amp; Category-Based Imputation</w:t>
+      </w:r>
+    </w:p>
+    <w:p>
+      <w:r>
+        <w:tab/>
+        <w:t>While treating the dataset firstly the missing values were analyzed and treated. For which .</w:t>
+      </w:r>
+      <w:proofErr w:type="spellStart"/>
+      <w:r>
+        <w:t>isnull</w:t>
+      </w:r>
+      <w:proofErr w:type="spellEnd"/>
+      <w:r>
+        <w:t>()</w:t>
+      </w:r>
+      <w:r>
+        <w:t>.sum()</w:t>
+      </w:r>
+      <w:r>
+        <w:t xml:space="preserve"> was used</w:t>
+      </w:r>
+      <w:r>
+        <w:t xml:space="preserve"> to see total numbers of missing data in each </w:t>
+      </w:r>
+      <w:proofErr w:type="gramStart"/>
+      <w:r>
+        <w:t>columns</w:t>
+      </w:r>
+      <w:proofErr w:type="gramEnd"/>
+      <w:r>
+        <w:t>.</w:t>
+      </w:r>
+    </w:p>
+    <w:p>
+      <w:r>
+        <w:rPr>
+          <w:noProof/>
+        </w:rPr>
+        <w:drawing>
+          <wp:inline distT="0" distB="0" distL="0" distR="0" wp14:anchorId="39D80106" wp14:editId="2EAC2749">
+            <wp:extent cx="4744112" cy="5649113"/>
+            <wp:effectExtent l="0" t="0" r="0" b="8890"/>
+            <wp:docPr id="1571080821" name="Picture 1"/>
+            <wp:cNvGraphicFramePr>
+              <a:graphicFrameLocks xmlns:a="http://schemas.openxmlformats.org/drawingml/2006/main" noChangeAspect="1"/>
+            </wp:cNvGraphicFramePr>
+            <a:graphic xmlns:a="http://schemas.openxmlformats.org/drawingml/2006/main">
+              <a:graphicData uri="http://schemas.openxmlformats.org/drawingml/2006/picture">
+                <pic:pic xmlns:pic="http://schemas.openxmlformats.org/drawingml/2006/picture">
+                  <pic:nvPicPr>
+                    <pic:cNvPr id="1571080821" name=""/>
+                    <pic:cNvPicPr/>
+                  </pic:nvPicPr>
+                  <pic:blipFill>
+                    <a:blip r:embed="rId5"/>
+                    <a:stretch>
+                      <a:fillRect/>
+                    </a:stretch>
+                  </pic:blipFill>
+                  <pic:spPr>
+                    <a:xfrm>
+                      <a:off x="0" y="0"/>
+                      <a:ext cx="4744112" cy="5649113"/>
+                    </a:xfrm>
+                    <a:prstGeom prst="rect">
+                      <a:avLst/>
+                    </a:prstGeom>
+                  </pic:spPr>
+                </pic:pic>
+              </a:graphicData>
+            </a:graphic>
+          </wp:inline>
+        </w:drawing>
+      </w:r>
+      <w:r>
+        <w:t xml:space="preserve"> </w:t>
+      </w:r>
+    </w:p>
+    <w:p>
+      <w:r>
+        <w:t xml:space="preserve">Through this result, 37 review </w:t>
+      </w:r>
+      <w:proofErr w:type="gramStart"/>
+      <w:r>
+        <w:t>rating</w:t>
+      </w:r>
+      <w:proofErr w:type="gramEnd"/>
+      <w:r>
+        <w:t xml:space="preserve"> were missing in the dataset. For the dataset to be evaluated correctly we need to replace the missing value with the average review rating of each category and replace the nan values with the median values.</w:t>
+      </w:r>
+    </w:p>
+    <w:p>
+      <w:r>
+        <w:rPr>
+          <w:noProof/>
+        </w:rPr>
+        <w:lastRenderedPageBreak/>
+        <w:drawing>
+          <wp:inline distT="0" distB="0" distL="0" distR="0" wp14:anchorId="61A92CB0" wp14:editId="022DD240">
+            <wp:extent cx="5943600" cy="4019550"/>
+            <wp:effectExtent l="0" t="0" r="0" b="0"/>
+            <wp:docPr id="1272177337" name="Picture 1"/>
+            <wp:cNvGraphicFramePr>
+              <a:graphicFrameLocks xmlns:a="http://schemas.openxmlformats.org/drawingml/2006/main" noChangeAspect="1"/>
+            </wp:cNvGraphicFramePr>
+            <a:graphic xmlns:a="http://schemas.openxmlformats.org/drawingml/2006/main">
+              <a:graphicData uri="http://schemas.openxmlformats.org/drawingml/2006/picture">
+                <pic:pic xmlns:pic="http://schemas.openxmlformats.org/drawingml/2006/picture">
+                  <pic:nvPicPr>
+                    <pic:cNvPr id="1272177337" name=""/>
+                    <pic:cNvPicPr/>
+                  </pic:nvPicPr>
+                  <pic:blipFill>
+                    <a:blip r:embed="rId6"/>
+                    <a:stretch>
+                      <a:fillRect/>
+                    </a:stretch>
+                  </pic:blipFill>
+                  <pic:spPr>
+                    <a:xfrm>
+                      <a:off x="0" y="0"/>
+                      <a:ext cx="5943600" cy="4019550"/>
+                    </a:xfrm>
+                    <a:prstGeom prst="rect">
+                      <a:avLst/>
+                    </a:prstGeom>
+                  </pic:spPr>
+                </pic:pic>
+              </a:graphicData>
+            </a:graphic>
+          </wp:inline>
+        </w:drawing>
+      </w:r>
+    </w:p>
+    <w:p/>
+    <w:p>
+      <w:pPr>
         <w:rPr>
           <w:b/>
           <w:bCs/>
         </w:rPr>
-        <w:t>Treatment:</w:t>
-      </w:r>
-      <w:r>
-        <w:t xml:space="preserve"> Missing ratings were imputed using category-level median ratings via grouped transformation rather than a global </w:t>
-      </w:r>
-      <w:proofErr w:type="gramStart"/>
-      <w:r>
-        <w:t>mean</w:t>
-      </w:r>
-      <w:proofErr w:type="gramEnd"/>
-      <w:r>
-        <w:t>, preserving category-specific rating distributions:</w:t>
-      </w:r>
-    </w:p>
-    <w:p>
-      <w:r>
-        <w:t>Python</w:t>
-      </w:r>
-    </w:p>
-    <w:p>
-      <w:proofErr w:type="spellStart"/>
-      <w:r>
-        <w:t>df</w:t>
-      </w:r>
-      <w:proofErr w:type="spellEnd"/>
-      <w:r>
-        <w:t xml:space="preserve">['Review Rating'] = </w:t>
-      </w:r>
-      <w:proofErr w:type="spellStart"/>
-      <w:r>
-        <w:t>df.groupby</w:t>
-      </w:r>
-      <w:proofErr w:type="spellEnd"/>
-      <w:r>
-        <w:t xml:space="preserve">('Category')['Review Rating'].transform(lambda x: </w:t>
-      </w:r>
-      <w:proofErr w:type="spellStart"/>
-      <w:r>
-        <w:t>x.fillna</w:t>
-      </w:r>
-      <w:proofErr w:type="spellEnd"/>
-      <w:r>
-        <w:t>(</w:t>
-      </w:r>
-      <w:proofErr w:type="spellStart"/>
-      <w:r>
-        <w:t>x.median</w:t>
-      </w:r>
-      <w:proofErr w:type="spellEnd"/>
-      <w:r>
-        <w:t>()))</w:t>
-      </w:r>
-    </w:p>
-    <w:p>
-      <w:pPr>
+      </w:pPr>
+      <w:r>
         <w:rPr>
           <w:b/>
           <w:bCs/>
         </w:rPr>
-      </w:pPr>
-      <w:r>
-        <w:rPr>
-          <w:b/>
-          <w:bCs/>
-        </w:rPr>
-        <w:t>Step 3.2: Column Standardization &amp; Normalization</w:t>
+        <w:t>Step 2: Column Standardization &amp; Normalization</w:t>
       </w:r>
     </w:p>
     <w:p>
@@ -324,6 +389,56 @@
     </w:p>
     <w:p>
       <w:pPr>
+        <w:ind w:left="720"/>
+      </w:pPr>
+      <w:r>
+        <w:rPr>
+          <w:noProof/>
+        </w:rPr>
+        <w:drawing>
+          <wp:inline distT="0" distB="0" distL="0" distR="0" wp14:anchorId="7C4C3B0D" wp14:editId="1109106E">
+            <wp:extent cx="4046220" cy="1915902"/>
+            <wp:effectExtent l="0" t="0" r="0" b="8255"/>
+            <wp:docPr id="2109593306" name="Picture 1"/>
+            <wp:cNvGraphicFramePr>
+              <a:graphicFrameLocks xmlns:a="http://schemas.openxmlformats.org/drawingml/2006/main" noChangeAspect="1"/>
+            </wp:cNvGraphicFramePr>
+            <a:graphic xmlns:a="http://schemas.openxmlformats.org/drawingml/2006/main">
+              <a:graphicData uri="http://schemas.openxmlformats.org/drawingml/2006/picture">
+                <pic:pic xmlns:pic="http://schemas.openxmlformats.org/drawingml/2006/picture">
+                  <pic:nvPicPr>
+                    <pic:cNvPr id="2109593306" name=""/>
+                    <pic:cNvPicPr/>
+                  </pic:nvPicPr>
+                  <pic:blipFill>
+                    <a:blip r:embed="rId7"/>
+                    <a:stretch>
+                      <a:fillRect/>
+                    </a:stretch>
+                  </pic:blipFill>
+                  <pic:spPr>
+                    <a:xfrm>
+                      <a:off x="0" y="0"/>
+                      <a:ext cx="4054905" cy="1920014"/>
+                    </a:xfrm>
+                    <a:prstGeom prst="rect">
+                      <a:avLst/>
+                    </a:prstGeom>
+                  </pic:spPr>
+                </pic:pic>
+              </a:graphicData>
+            </a:graphic>
+          </wp:inline>
+        </w:drawing>
+      </w:r>
+    </w:p>
+    <w:p>
+      <w:pPr>
+        <w:ind w:left="720"/>
+      </w:pPr>
+    </w:p>
+    <w:p>
+      <w:pPr>
         <w:rPr>
           <w:b/>
           <w:bCs/>
@@ -334,329 +449,71 @@
           <w:b/>
           <w:bCs/>
         </w:rPr>
-        <w:t>Step 3.3: Demographic Binning &amp; Feature Engineering</w:t>
-      </w:r>
-    </w:p>
-    <w:p>
-      <w:r>
-        <w:t xml:space="preserve">To prepare data for targeted demographic marketing strategies, the continuous age attribute (ranging from 18 to 70 years, median: 44) was partitioned into four quantile-based age groups using </w:t>
-      </w:r>
-      <w:proofErr w:type="spellStart"/>
-      <w:r>
-        <w:t>pd.qcut</w:t>
-      </w:r>
-      <w:proofErr w:type="spellEnd"/>
-      <w:r>
-        <w:t>():</w:t>
-      </w:r>
-    </w:p>
-    <w:tbl>
-      <w:tblPr>
-        <w:tblW w:w="0" w:type="auto"/>
-        <w:tblCellSpacing w:w="15" w:type="dxa"/>
-        <w:tblCellMar>
-          <w:top w:w="15" w:type="dxa"/>
-          <w:left w:w="15" w:type="dxa"/>
-          <w:bottom w:w="15" w:type="dxa"/>
-          <w:right w:w="15" w:type="dxa"/>
-        </w:tblCellMar>
-        <w:tblLook w:val="04A0" w:firstRow="1" w:lastRow="0" w:firstColumn="1" w:lastColumn="0" w:noHBand="0" w:noVBand="1"/>
-      </w:tblPr>
-      <w:tblGrid>
-        <w:gridCol w:w="2208"/>
-        <w:gridCol w:w="3162"/>
-      </w:tblGrid>
-      <w:tr>
-        <w:trPr>
-          <w:tblHeader/>
-          <w:tblCellSpacing w:w="15" w:type="dxa"/>
-        </w:trPr>
-        <w:tc>
-          <w:tcPr>
-            <w:tcW w:w="0" w:type="auto"/>
-            <w:tcBorders>
-              <w:top w:val="single" w:sz="6" w:space="0" w:color="C4C7C5"/>
-              <w:left w:val="single" w:sz="6" w:space="0" w:color="C4C7C5"/>
-              <w:bottom w:val="single" w:sz="6" w:space="0" w:color="C4C7C5"/>
-              <w:right w:val="single" w:sz="6" w:space="0" w:color="C4C7C5"/>
-            </w:tcBorders>
-            <w:tcMar>
-              <w:top w:w="120" w:type="dxa"/>
-              <w:left w:w="180" w:type="dxa"/>
-              <w:bottom w:w="120" w:type="dxa"/>
-              <w:right w:w="180" w:type="dxa"/>
-            </w:tcMar>
-            <w:vAlign w:val="center"/>
-            <w:hideMark/>
-          </w:tcPr>
-          <w:p>
-            <w:r>
-              <w:rPr>
-                <w:b/>
-                <w:bCs/>
-              </w:rPr>
-              <w:t>Age Group Label</w:t>
-            </w:r>
-          </w:p>
-        </w:tc>
-        <w:tc>
-          <w:tcPr>
-            <w:tcW w:w="0" w:type="auto"/>
-            <w:tcBorders>
-              <w:top w:val="single" w:sz="6" w:space="0" w:color="C4C7C5"/>
-              <w:left w:val="single" w:sz="6" w:space="0" w:color="C4C7C5"/>
-              <w:bottom w:val="single" w:sz="6" w:space="0" w:color="C4C7C5"/>
-              <w:right w:val="single" w:sz="6" w:space="0" w:color="C4C7C5"/>
-            </w:tcBorders>
-            <w:tcMar>
-              <w:top w:w="120" w:type="dxa"/>
-              <w:left w:w="180" w:type="dxa"/>
-              <w:bottom w:w="120" w:type="dxa"/>
-              <w:right w:w="180" w:type="dxa"/>
-            </w:tcMar>
-            <w:vAlign w:val="center"/>
-            <w:hideMark/>
-          </w:tcPr>
-          <w:p>
-            <w:r>
-              <w:rPr>
-                <w:b/>
-                <w:bCs/>
-              </w:rPr>
-              <w:t>Quantile / Target Segment</w:t>
-            </w:r>
-          </w:p>
-        </w:tc>
-      </w:tr>
-      <w:tr>
-        <w:trPr>
-          <w:tblCellSpacing w:w="15" w:type="dxa"/>
-        </w:trPr>
-        <w:tc>
-          <w:tcPr>
-            <w:tcW w:w="0" w:type="auto"/>
-            <w:tcBorders>
-              <w:top w:val="single" w:sz="6" w:space="0" w:color="C4C7C5"/>
-              <w:left w:val="single" w:sz="6" w:space="0" w:color="C4C7C5"/>
-              <w:bottom w:val="single" w:sz="6" w:space="0" w:color="C4C7C5"/>
-              <w:right w:val="single" w:sz="6" w:space="0" w:color="C4C7C5"/>
-            </w:tcBorders>
-            <w:tcMar>
-              <w:top w:w="120" w:type="dxa"/>
-              <w:left w:w="180" w:type="dxa"/>
-              <w:bottom w:w="120" w:type="dxa"/>
-              <w:right w:w="180" w:type="dxa"/>
-            </w:tcMar>
-            <w:vAlign w:val="center"/>
-            <w:hideMark/>
-          </w:tcPr>
-          <w:p>
-            <w:r>
-              <w:rPr>
-                <w:b/>
-                <w:bCs/>
-              </w:rPr>
-              <w:t>Young Adults</w:t>
-            </w:r>
-          </w:p>
-        </w:tc>
-        <w:tc>
-          <w:tcPr>
-            <w:tcW w:w="0" w:type="auto"/>
-            <w:tcBorders>
-              <w:top w:val="single" w:sz="6" w:space="0" w:color="C4C7C5"/>
-              <w:left w:val="single" w:sz="6" w:space="0" w:color="C4C7C5"/>
-              <w:bottom w:val="single" w:sz="6" w:space="0" w:color="C4C7C5"/>
-              <w:right w:val="single" w:sz="6" w:space="0" w:color="C4C7C5"/>
-            </w:tcBorders>
-            <w:tcMar>
-              <w:top w:w="120" w:type="dxa"/>
-              <w:left w:w="180" w:type="dxa"/>
-              <w:bottom w:w="120" w:type="dxa"/>
-              <w:right w:w="180" w:type="dxa"/>
-            </w:tcMar>
-            <w:vAlign w:val="center"/>
-            <w:hideMark/>
-          </w:tcPr>
-          <w:p>
-            <w:r>
-              <w:t>Q1 (18 – 31 years)</w:t>
-            </w:r>
-          </w:p>
-        </w:tc>
-      </w:tr>
-      <w:tr>
-        <w:trPr>
-          <w:tblCellSpacing w:w="15" w:type="dxa"/>
-        </w:trPr>
-        <w:tc>
-          <w:tcPr>
-            <w:tcW w:w="0" w:type="auto"/>
-            <w:tcBorders>
-              <w:top w:val="single" w:sz="6" w:space="0" w:color="C4C7C5"/>
-              <w:left w:val="single" w:sz="6" w:space="0" w:color="C4C7C5"/>
-              <w:bottom w:val="single" w:sz="6" w:space="0" w:color="C4C7C5"/>
-              <w:right w:val="single" w:sz="6" w:space="0" w:color="C4C7C5"/>
-            </w:tcBorders>
-            <w:tcMar>
-              <w:top w:w="120" w:type="dxa"/>
-              <w:left w:w="180" w:type="dxa"/>
-              <w:bottom w:w="120" w:type="dxa"/>
-              <w:right w:w="180" w:type="dxa"/>
-            </w:tcMar>
-            <w:vAlign w:val="center"/>
-            <w:hideMark/>
-          </w:tcPr>
-          <w:p>
-            <w:r>
-              <w:rPr>
-                <w:b/>
-                <w:bCs/>
-              </w:rPr>
-              <w:t>Adults</w:t>
-            </w:r>
-          </w:p>
-        </w:tc>
-        <w:tc>
-          <w:tcPr>
-            <w:tcW w:w="0" w:type="auto"/>
-            <w:tcBorders>
-              <w:top w:val="single" w:sz="6" w:space="0" w:color="C4C7C5"/>
-              <w:left w:val="single" w:sz="6" w:space="0" w:color="C4C7C5"/>
-              <w:bottom w:val="single" w:sz="6" w:space="0" w:color="C4C7C5"/>
-              <w:right w:val="single" w:sz="6" w:space="0" w:color="C4C7C5"/>
-            </w:tcBorders>
-            <w:tcMar>
-              <w:top w:w="120" w:type="dxa"/>
-              <w:left w:w="180" w:type="dxa"/>
-              <w:bottom w:w="120" w:type="dxa"/>
-              <w:right w:w="180" w:type="dxa"/>
-            </w:tcMar>
-            <w:vAlign w:val="center"/>
-            <w:hideMark/>
-          </w:tcPr>
-          <w:p>
-            <w:r>
-              <w:t>Q2 (31 – 44 years)</w:t>
-            </w:r>
-          </w:p>
-        </w:tc>
-      </w:tr>
-      <w:tr>
-        <w:trPr>
-          <w:tblCellSpacing w:w="15" w:type="dxa"/>
-        </w:trPr>
-        <w:tc>
-          <w:tcPr>
-            <w:tcW w:w="0" w:type="auto"/>
-            <w:tcBorders>
-              <w:top w:val="single" w:sz="6" w:space="0" w:color="C4C7C5"/>
-              <w:left w:val="single" w:sz="6" w:space="0" w:color="C4C7C5"/>
-              <w:bottom w:val="single" w:sz="6" w:space="0" w:color="C4C7C5"/>
-              <w:right w:val="single" w:sz="6" w:space="0" w:color="C4C7C5"/>
-            </w:tcBorders>
-            <w:tcMar>
-              <w:top w:w="120" w:type="dxa"/>
-              <w:left w:w="180" w:type="dxa"/>
-              <w:bottom w:w="120" w:type="dxa"/>
-              <w:right w:w="180" w:type="dxa"/>
-            </w:tcMar>
-            <w:vAlign w:val="center"/>
-            <w:hideMark/>
-          </w:tcPr>
-          <w:p>
-            <w:r>
-              <w:rPr>
-                <w:b/>
-                <w:bCs/>
-              </w:rPr>
-              <w:t>Middle Aged</w:t>
-            </w:r>
-          </w:p>
-        </w:tc>
-        <w:tc>
-          <w:tcPr>
-            <w:tcW w:w="0" w:type="auto"/>
-            <w:tcBorders>
-              <w:top w:val="single" w:sz="6" w:space="0" w:color="C4C7C5"/>
-              <w:left w:val="single" w:sz="6" w:space="0" w:color="C4C7C5"/>
-              <w:bottom w:val="single" w:sz="6" w:space="0" w:color="C4C7C5"/>
-              <w:right w:val="single" w:sz="6" w:space="0" w:color="C4C7C5"/>
-            </w:tcBorders>
-            <w:tcMar>
-              <w:top w:w="120" w:type="dxa"/>
-              <w:left w:w="180" w:type="dxa"/>
-              <w:bottom w:w="120" w:type="dxa"/>
-              <w:right w:w="180" w:type="dxa"/>
-            </w:tcMar>
-            <w:vAlign w:val="center"/>
-            <w:hideMark/>
-          </w:tcPr>
-          <w:p>
-            <w:r>
-              <w:t>Q3 (44 – 57 years)</w:t>
-            </w:r>
-          </w:p>
-        </w:tc>
-      </w:tr>
-      <w:tr>
-        <w:trPr>
-          <w:tblCellSpacing w:w="15" w:type="dxa"/>
-        </w:trPr>
-        <w:tc>
-          <w:tcPr>
-            <w:tcW w:w="0" w:type="auto"/>
-            <w:tcBorders>
-              <w:top w:val="single" w:sz="6" w:space="0" w:color="C4C7C5"/>
-              <w:left w:val="single" w:sz="6" w:space="0" w:color="C4C7C5"/>
-              <w:bottom w:val="single" w:sz="6" w:space="0" w:color="C4C7C5"/>
-              <w:right w:val="single" w:sz="6" w:space="0" w:color="C4C7C5"/>
-            </w:tcBorders>
-            <w:tcMar>
-              <w:top w:w="120" w:type="dxa"/>
-              <w:left w:w="180" w:type="dxa"/>
-              <w:bottom w:w="120" w:type="dxa"/>
-              <w:right w:w="180" w:type="dxa"/>
-            </w:tcMar>
-            <w:vAlign w:val="center"/>
-            <w:hideMark/>
-          </w:tcPr>
-          <w:p>
-            <w:r>
-              <w:rPr>
-                <w:b/>
-                <w:bCs/>
-              </w:rPr>
-              <w:t>Senior</w:t>
-            </w:r>
-          </w:p>
-        </w:tc>
-        <w:tc>
-          <w:tcPr>
-            <w:tcW w:w="0" w:type="auto"/>
-            <w:tcBorders>
-              <w:top w:val="single" w:sz="6" w:space="0" w:color="C4C7C5"/>
-              <w:left w:val="single" w:sz="6" w:space="0" w:color="C4C7C5"/>
-              <w:bottom w:val="single" w:sz="6" w:space="0" w:color="C4C7C5"/>
-              <w:right w:val="single" w:sz="6" w:space="0" w:color="C4C7C5"/>
-            </w:tcBorders>
-            <w:tcMar>
-              <w:top w:w="120" w:type="dxa"/>
-              <w:left w:w="180" w:type="dxa"/>
-              <w:bottom w:w="120" w:type="dxa"/>
-              <w:right w:w="180" w:type="dxa"/>
-            </w:tcMar>
-            <w:vAlign w:val="center"/>
-            <w:hideMark/>
-          </w:tcPr>
-          <w:p>
-            <w:r>
-              <w:t>Q4 (57 – 70 years)</w:t>
-            </w:r>
-          </w:p>
-        </w:tc>
-      </w:tr>
-    </w:tbl>
+        <w:lastRenderedPageBreak/>
+        <w:t>Step 3: Demographic Binning &amp; Feature Engineering</w:t>
+      </w:r>
+    </w:p>
+    <w:p>
+      <w:r>
+        <w:t>To prepare data for targeted demographic marketing strategies, the continuous age attribute (ranging from 18 to 70 years, median: 44) was partitioned into four quantile-based age groups using pd.qcut():</w:t>
+      </w:r>
+    </w:p>
+    <w:p>
+      <w:r>
+        <w:rPr>
+          <w:noProof/>
+        </w:rPr>
+        <w:drawing>
+          <wp:anchor distT="0" distB="0" distL="114300" distR="114300" simplePos="0" relativeHeight="251658240" behindDoc="1" locked="0" layoutInCell="1" allowOverlap="1" wp14:anchorId="02EC0A8D" wp14:editId="698B39E7">
+            <wp:simplePos x="0" y="0"/>
+            <wp:positionH relativeFrom="column">
+              <wp:posOffset>762000</wp:posOffset>
+            </wp:positionH>
+            <wp:positionV relativeFrom="paragraph">
+              <wp:posOffset>-3810</wp:posOffset>
+            </wp:positionV>
+            <wp:extent cx="4427220" cy="3817620"/>
+            <wp:effectExtent l="0" t="0" r="0" b="0"/>
+            <wp:wrapTopAndBottom/>
+            <wp:docPr id="142435093" name="Picture 1"/>
+            <wp:cNvGraphicFramePr>
+              <a:graphicFrameLocks xmlns:a="http://schemas.openxmlformats.org/drawingml/2006/main" noChangeAspect="1"/>
+            </wp:cNvGraphicFramePr>
+            <a:graphic xmlns:a="http://schemas.openxmlformats.org/drawingml/2006/main">
+              <a:graphicData uri="http://schemas.openxmlformats.org/drawingml/2006/picture">
+                <pic:pic xmlns:pic="http://schemas.openxmlformats.org/drawingml/2006/picture">
+                  <pic:nvPicPr>
+                    <pic:cNvPr id="142435093" name=""/>
+                    <pic:cNvPicPr/>
+                  </pic:nvPicPr>
+                  <pic:blipFill>
+                    <a:blip r:embed="rId8">
+                      <a:extLst>
+                        <a:ext uri="{28A0092B-C50C-407E-A947-70E740481C1C}">
+                          <a14:useLocalDpi xmlns:a14="http://schemas.microsoft.com/office/drawing/2010/main" val="0"/>
+                        </a:ext>
+                      </a:extLst>
+                    </a:blip>
+                    <a:stretch>
+                      <a:fillRect/>
+                    </a:stretch>
+                  </pic:blipFill>
+                  <pic:spPr>
+                    <a:xfrm>
+                      <a:off x="0" y="0"/>
+                      <a:ext cx="4427220" cy="3817620"/>
+                    </a:xfrm>
+                    <a:prstGeom prst="rect">
+                      <a:avLst/>
+                    </a:prstGeom>
+                  </pic:spPr>
+                </pic:pic>
+              </a:graphicData>
+            </a:graphic>
+          </wp:anchor>
+        </w:drawing>
+      </w:r>
+    </w:p>
     <w:p>
       <w:pPr>
         <w:rPr>
@@ -669,454 +526,13 @@
           <w:b/>
           <w:bCs/>
         </w:rPr>
-        <w:t>Step 3.4: Categorical Mapping &amp; Numeric Conversion</w:t>
-      </w:r>
-    </w:p>
-    <w:p>
-      <w:r>
-        <w:lastRenderedPageBreak/>
-        <w:t xml:space="preserve">The </w:t>
-      </w:r>
-      <w:proofErr w:type="spellStart"/>
-      <w:r>
-        <w:t>frequency_of_purchases</w:t>
-      </w:r>
-      <w:proofErr w:type="spellEnd"/>
-      <w:r>
-        <w:t xml:space="preserve"> feature contained textual purchase cadences. These string descriptors were mapped to numerical values representing cycle duration in days (</w:t>
-      </w:r>
-      <w:proofErr w:type="spellStart"/>
-      <w:r>
-        <w:t>purchase_frequency_days</w:t>
-      </w:r>
-      <w:proofErr w:type="spellEnd"/>
-      <w:r>
-        <w:t>) to enable numerical modeling:</w:t>
-      </w:r>
-    </w:p>
-    <w:tbl>
-      <w:tblPr>
-        <w:tblW w:w="0" w:type="auto"/>
-        <w:tblCellSpacing w:w="15" w:type="dxa"/>
-        <w:tblCellMar>
-          <w:top w:w="15" w:type="dxa"/>
-          <w:left w:w="15" w:type="dxa"/>
-          <w:bottom w:w="15" w:type="dxa"/>
-          <w:right w:w="15" w:type="dxa"/>
-        </w:tblCellMar>
-        <w:tblLook w:val="04A0" w:firstRow="1" w:lastRow="0" w:firstColumn="1" w:lastColumn="0" w:noHBand="0" w:noVBand="1"/>
-      </w:tblPr>
-      <w:tblGrid>
-        <w:gridCol w:w="3406"/>
-        <w:gridCol w:w="3614"/>
-      </w:tblGrid>
-      <w:tr>
-        <w:trPr>
-          <w:tblHeader/>
-          <w:tblCellSpacing w:w="15" w:type="dxa"/>
-        </w:trPr>
-        <w:tc>
-          <w:tcPr>
-            <w:tcW w:w="0" w:type="auto"/>
-            <w:tcBorders>
-              <w:top w:val="single" w:sz="6" w:space="0" w:color="C4C7C5"/>
-              <w:left w:val="single" w:sz="6" w:space="0" w:color="C4C7C5"/>
-              <w:bottom w:val="single" w:sz="6" w:space="0" w:color="C4C7C5"/>
-              <w:right w:val="single" w:sz="6" w:space="0" w:color="C4C7C5"/>
-            </w:tcBorders>
-            <w:tcMar>
-              <w:top w:w="120" w:type="dxa"/>
-              <w:left w:w="180" w:type="dxa"/>
-              <w:bottom w:w="120" w:type="dxa"/>
-              <w:right w:w="180" w:type="dxa"/>
-            </w:tcMar>
-            <w:vAlign w:val="center"/>
-            <w:hideMark/>
-          </w:tcPr>
-          <w:p>
-            <w:r>
-              <w:rPr>
-                <w:b/>
-                <w:bCs/>
-              </w:rPr>
-              <w:t>Frequency String Descriptor</w:t>
-            </w:r>
-          </w:p>
-        </w:tc>
-        <w:tc>
-          <w:tcPr>
-            <w:tcW w:w="0" w:type="auto"/>
-            <w:tcBorders>
-              <w:top w:val="single" w:sz="6" w:space="0" w:color="C4C7C5"/>
-              <w:left w:val="single" w:sz="6" w:space="0" w:color="C4C7C5"/>
-              <w:bottom w:val="single" w:sz="6" w:space="0" w:color="C4C7C5"/>
-              <w:right w:val="single" w:sz="6" w:space="0" w:color="C4C7C5"/>
-            </w:tcBorders>
-            <w:tcMar>
-              <w:top w:w="120" w:type="dxa"/>
-              <w:left w:w="180" w:type="dxa"/>
-              <w:bottom w:w="120" w:type="dxa"/>
-              <w:right w:w="180" w:type="dxa"/>
-            </w:tcMar>
-            <w:vAlign w:val="center"/>
-            <w:hideMark/>
-          </w:tcPr>
-          <w:p>
-            <w:r>
-              <w:rPr>
-                <w:b/>
-                <w:bCs/>
-              </w:rPr>
-              <w:t>Mapped Cycle Duration (Days)</w:t>
-            </w:r>
-          </w:p>
-        </w:tc>
-      </w:tr>
-      <w:tr>
-        <w:trPr>
-          <w:tblCellSpacing w:w="15" w:type="dxa"/>
-        </w:trPr>
-        <w:tc>
-          <w:tcPr>
-            <w:tcW w:w="0" w:type="auto"/>
-            <w:tcBorders>
-              <w:top w:val="single" w:sz="6" w:space="0" w:color="C4C7C5"/>
-              <w:left w:val="single" w:sz="6" w:space="0" w:color="C4C7C5"/>
-              <w:bottom w:val="single" w:sz="6" w:space="0" w:color="C4C7C5"/>
-              <w:right w:val="single" w:sz="6" w:space="0" w:color="C4C7C5"/>
-            </w:tcBorders>
-            <w:tcMar>
-              <w:top w:w="120" w:type="dxa"/>
-              <w:left w:w="180" w:type="dxa"/>
-              <w:bottom w:w="120" w:type="dxa"/>
-              <w:right w:w="180" w:type="dxa"/>
-            </w:tcMar>
-            <w:vAlign w:val="center"/>
-            <w:hideMark/>
-          </w:tcPr>
-          <w:p>
-            <w:r>
-              <w:rPr>
-                <w:b/>
-                <w:bCs/>
-              </w:rPr>
-              <w:t>Weekly</w:t>
-            </w:r>
-          </w:p>
-        </w:tc>
-        <w:tc>
-          <w:tcPr>
-            <w:tcW w:w="0" w:type="auto"/>
-            <w:tcBorders>
-              <w:top w:val="single" w:sz="6" w:space="0" w:color="C4C7C5"/>
-              <w:left w:val="single" w:sz="6" w:space="0" w:color="C4C7C5"/>
-              <w:bottom w:val="single" w:sz="6" w:space="0" w:color="C4C7C5"/>
-              <w:right w:val="single" w:sz="6" w:space="0" w:color="C4C7C5"/>
-            </w:tcBorders>
-            <w:tcMar>
-              <w:top w:w="120" w:type="dxa"/>
-              <w:left w:w="180" w:type="dxa"/>
-              <w:bottom w:w="120" w:type="dxa"/>
-              <w:right w:w="180" w:type="dxa"/>
-            </w:tcMar>
-            <w:vAlign w:val="center"/>
-            <w:hideMark/>
-          </w:tcPr>
-          <w:p>
-            <w:r>
-              <w:t>7</w:t>
-            </w:r>
-          </w:p>
-        </w:tc>
-      </w:tr>
-      <w:tr>
-        <w:trPr>
-          <w:tblCellSpacing w:w="15" w:type="dxa"/>
-        </w:trPr>
-        <w:tc>
-          <w:tcPr>
-            <w:tcW w:w="0" w:type="auto"/>
-            <w:tcBorders>
-              <w:top w:val="single" w:sz="6" w:space="0" w:color="C4C7C5"/>
-              <w:left w:val="single" w:sz="6" w:space="0" w:color="C4C7C5"/>
-              <w:bottom w:val="single" w:sz="6" w:space="0" w:color="C4C7C5"/>
-              <w:right w:val="single" w:sz="6" w:space="0" w:color="C4C7C5"/>
-            </w:tcBorders>
-            <w:tcMar>
-              <w:top w:w="120" w:type="dxa"/>
-              <w:left w:w="180" w:type="dxa"/>
-              <w:bottom w:w="120" w:type="dxa"/>
-              <w:right w:w="180" w:type="dxa"/>
-            </w:tcMar>
-            <w:vAlign w:val="center"/>
-            <w:hideMark/>
-          </w:tcPr>
-          <w:p>
-            <w:r>
-              <w:rPr>
-                <w:b/>
-                <w:bCs/>
-              </w:rPr>
-              <w:t>Fortnightly / Bi-Weekly</w:t>
-            </w:r>
-          </w:p>
-        </w:tc>
-        <w:tc>
-          <w:tcPr>
-            <w:tcW w:w="0" w:type="auto"/>
-            <w:tcBorders>
-              <w:top w:val="single" w:sz="6" w:space="0" w:color="C4C7C5"/>
-              <w:left w:val="single" w:sz="6" w:space="0" w:color="C4C7C5"/>
-              <w:bottom w:val="single" w:sz="6" w:space="0" w:color="C4C7C5"/>
-              <w:right w:val="single" w:sz="6" w:space="0" w:color="C4C7C5"/>
-            </w:tcBorders>
-            <w:tcMar>
-              <w:top w:w="120" w:type="dxa"/>
-              <w:left w:w="180" w:type="dxa"/>
-              <w:bottom w:w="120" w:type="dxa"/>
-              <w:right w:w="180" w:type="dxa"/>
-            </w:tcMar>
-            <w:vAlign w:val="center"/>
-            <w:hideMark/>
-          </w:tcPr>
-          <w:p>
-            <w:r>
-              <w:t>14</w:t>
-            </w:r>
-          </w:p>
-        </w:tc>
-      </w:tr>
-      <w:tr>
-        <w:trPr>
-          <w:tblCellSpacing w:w="15" w:type="dxa"/>
-        </w:trPr>
-        <w:tc>
-          <w:tcPr>
-            <w:tcW w:w="0" w:type="auto"/>
-            <w:tcBorders>
-              <w:top w:val="single" w:sz="6" w:space="0" w:color="C4C7C5"/>
-              <w:left w:val="single" w:sz="6" w:space="0" w:color="C4C7C5"/>
-              <w:bottom w:val="single" w:sz="6" w:space="0" w:color="C4C7C5"/>
-              <w:right w:val="single" w:sz="6" w:space="0" w:color="C4C7C5"/>
-            </w:tcBorders>
-            <w:tcMar>
-              <w:top w:w="120" w:type="dxa"/>
-              <w:left w:w="180" w:type="dxa"/>
-              <w:bottom w:w="120" w:type="dxa"/>
-              <w:right w:w="180" w:type="dxa"/>
-            </w:tcMar>
-            <w:vAlign w:val="center"/>
-            <w:hideMark/>
-          </w:tcPr>
-          <w:p>
-            <w:r>
-              <w:rPr>
-                <w:b/>
-                <w:bCs/>
-              </w:rPr>
-              <w:t>Monthly</w:t>
-            </w:r>
-          </w:p>
-        </w:tc>
-        <w:tc>
-          <w:tcPr>
-            <w:tcW w:w="0" w:type="auto"/>
-            <w:tcBorders>
-              <w:top w:val="single" w:sz="6" w:space="0" w:color="C4C7C5"/>
-              <w:left w:val="single" w:sz="6" w:space="0" w:color="C4C7C5"/>
-              <w:bottom w:val="single" w:sz="6" w:space="0" w:color="C4C7C5"/>
-              <w:right w:val="single" w:sz="6" w:space="0" w:color="C4C7C5"/>
-            </w:tcBorders>
-            <w:tcMar>
-              <w:top w:w="120" w:type="dxa"/>
-              <w:left w:w="180" w:type="dxa"/>
-              <w:bottom w:w="120" w:type="dxa"/>
-              <w:right w:w="180" w:type="dxa"/>
-            </w:tcMar>
-            <w:vAlign w:val="center"/>
-            <w:hideMark/>
-          </w:tcPr>
-          <w:p>
-            <w:r>
-              <w:t>30</w:t>
-            </w:r>
-          </w:p>
-        </w:tc>
-      </w:tr>
-      <w:tr>
-        <w:trPr>
-          <w:tblCellSpacing w:w="15" w:type="dxa"/>
-        </w:trPr>
-        <w:tc>
-          <w:tcPr>
-            <w:tcW w:w="0" w:type="auto"/>
-            <w:tcBorders>
-              <w:top w:val="single" w:sz="6" w:space="0" w:color="C4C7C5"/>
-              <w:left w:val="single" w:sz="6" w:space="0" w:color="C4C7C5"/>
-              <w:bottom w:val="single" w:sz="6" w:space="0" w:color="C4C7C5"/>
-              <w:right w:val="single" w:sz="6" w:space="0" w:color="C4C7C5"/>
-            </w:tcBorders>
-            <w:tcMar>
-              <w:top w:w="120" w:type="dxa"/>
-              <w:left w:w="180" w:type="dxa"/>
-              <w:bottom w:w="120" w:type="dxa"/>
-              <w:right w:w="180" w:type="dxa"/>
-            </w:tcMar>
-            <w:vAlign w:val="center"/>
-            <w:hideMark/>
-          </w:tcPr>
-          <w:p>
-            <w:r>
-              <w:rPr>
-                <w:b/>
-                <w:bCs/>
-              </w:rPr>
-              <w:t>Every 3 Months</w:t>
-            </w:r>
-          </w:p>
-        </w:tc>
-        <w:tc>
-          <w:tcPr>
-            <w:tcW w:w="0" w:type="auto"/>
-            <w:tcBorders>
-              <w:top w:val="single" w:sz="6" w:space="0" w:color="C4C7C5"/>
-              <w:left w:val="single" w:sz="6" w:space="0" w:color="C4C7C5"/>
-              <w:bottom w:val="single" w:sz="6" w:space="0" w:color="C4C7C5"/>
-              <w:right w:val="single" w:sz="6" w:space="0" w:color="C4C7C5"/>
-            </w:tcBorders>
-            <w:tcMar>
-              <w:top w:w="120" w:type="dxa"/>
-              <w:left w:w="180" w:type="dxa"/>
-              <w:bottom w:w="120" w:type="dxa"/>
-              <w:right w:w="180" w:type="dxa"/>
-            </w:tcMar>
-            <w:vAlign w:val="center"/>
-            <w:hideMark/>
-          </w:tcPr>
-          <w:p>
-            <w:r>
-              <w:t>9</w:t>
-            </w:r>
-          </w:p>
-        </w:tc>
-      </w:tr>
-      <w:tr>
-        <w:trPr>
-          <w:tblCellSpacing w:w="15" w:type="dxa"/>
-        </w:trPr>
-        <w:tc>
-          <w:tcPr>
-            <w:tcW w:w="0" w:type="auto"/>
-            <w:tcBorders>
-              <w:top w:val="single" w:sz="6" w:space="0" w:color="C4C7C5"/>
-              <w:left w:val="single" w:sz="6" w:space="0" w:color="C4C7C5"/>
-              <w:bottom w:val="single" w:sz="6" w:space="0" w:color="C4C7C5"/>
-              <w:right w:val="single" w:sz="6" w:space="0" w:color="C4C7C5"/>
-            </w:tcBorders>
-            <w:tcMar>
-              <w:top w:w="120" w:type="dxa"/>
-              <w:left w:w="180" w:type="dxa"/>
-              <w:bottom w:w="120" w:type="dxa"/>
-              <w:right w:w="180" w:type="dxa"/>
-            </w:tcMar>
-            <w:vAlign w:val="center"/>
-            <w:hideMark/>
-          </w:tcPr>
-          <w:p>
-            <w:r>
-              <w:rPr>
-                <w:b/>
-                <w:bCs/>
-              </w:rPr>
-              <w:t>Quarterly</w:t>
-            </w:r>
-          </w:p>
-        </w:tc>
-        <w:tc>
-          <w:tcPr>
-            <w:tcW w:w="0" w:type="auto"/>
-            <w:tcBorders>
-              <w:top w:val="single" w:sz="6" w:space="0" w:color="C4C7C5"/>
-              <w:left w:val="single" w:sz="6" w:space="0" w:color="C4C7C5"/>
-              <w:bottom w:val="single" w:sz="6" w:space="0" w:color="C4C7C5"/>
-              <w:right w:val="single" w:sz="6" w:space="0" w:color="C4C7C5"/>
-            </w:tcBorders>
-            <w:tcMar>
-              <w:top w:w="120" w:type="dxa"/>
-              <w:left w:w="180" w:type="dxa"/>
-              <w:bottom w:w="120" w:type="dxa"/>
-              <w:right w:w="180" w:type="dxa"/>
-            </w:tcMar>
-            <w:vAlign w:val="center"/>
-            <w:hideMark/>
-          </w:tcPr>
-          <w:p>
-            <w:r>
-              <w:t>90</w:t>
-            </w:r>
-          </w:p>
-        </w:tc>
-      </w:tr>
-      <w:tr>
-        <w:trPr>
-          <w:tblCellSpacing w:w="15" w:type="dxa"/>
-        </w:trPr>
-        <w:tc>
-          <w:tcPr>
-            <w:tcW w:w="0" w:type="auto"/>
-            <w:tcBorders>
-              <w:top w:val="single" w:sz="6" w:space="0" w:color="C4C7C5"/>
-              <w:left w:val="single" w:sz="6" w:space="0" w:color="C4C7C5"/>
-              <w:bottom w:val="single" w:sz="6" w:space="0" w:color="C4C7C5"/>
-              <w:right w:val="single" w:sz="6" w:space="0" w:color="C4C7C5"/>
-            </w:tcBorders>
-            <w:tcMar>
-              <w:top w:w="120" w:type="dxa"/>
-              <w:left w:w="180" w:type="dxa"/>
-              <w:bottom w:w="120" w:type="dxa"/>
-              <w:right w:w="180" w:type="dxa"/>
-            </w:tcMar>
-            <w:vAlign w:val="center"/>
-            <w:hideMark/>
-          </w:tcPr>
-          <w:p>
-            <w:r>
-              <w:rPr>
-                <w:b/>
-                <w:bCs/>
-              </w:rPr>
-              <w:t>Annually</w:t>
-            </w:r>
-          </w:p>
-        </w:tc>
-        <w:tc>
-          <w:tcPr>
-            <w:tcW w:w="0" w:type="auto"/>
-            <w:tcBorders>
-              <w:top w:val="single" w:sz="6" w:space="0" w:color="C4C7C5"/>
-              <w:left w:val="single" w:sz="6" w:space="0" w:color="C4C7C5"/>
-              <w:bottom w:val="single" w:sz="6" w:space="0" w:color="C4C7C5"/>
-              <w:right w:val="single" w:sz="6" w:space="0" w:color="C4C7C5"/>
-            </w:tcBorders>
-            <w:tcMar>
-              <w:top w:w="120" w:type="dxa"/>
-              <w:left w:w="180" w:type="dxa"/>
-              <w:bottom w:w="120" w:type="dxa"/>
-              <w:right w:w="180" w:type="dxa"/>
-            </w:tcMar>
-            <w:vAlign w:val="center"/>
-            <w:hideMark/>
-          </w:tcPr>
-          <w:p>
-            <w:r>
-              <w:t>365</w:t>
-            </w:r>
-          </w:p>
-        </w:tc>
-      </w:tr>
-    </w:tbl>
-    <w:p>
-      <w:pPr>
+        <w:br/>
+      </w:r>
+    </w:p>
+    <w:p>
+      <w:pPr>
+        <w:spacing w:after="160" w:line="278" w:lineRule="auto"/>
+        <w:jc w:val="left"/>
         <w:rPr>
           <w:b/>
           <w:bCs/>
@@ -1127,51 +543,11 @@
           <w:b/>
           <w:bCs/>
         </w:rPr>
-        <w:t>Step 3.5: Redundancy Analysis &amp; Feature Elimination</w:t>
-      </w:r>
-    </w:p>
-    <w:p>
-      <w:r>
-        <w:t xml:space="preserve">A comparison between </w:t>
-      </w:r>
-      <w:proofErr w:type="spellStart"/>
-      <w:r>
-        <w:t>discount_applied</w:t>
-      </w:r>
-      <w:proofErr w:type="spellEnd"/>
-      <w:r>
-        <w:t xml:space="preserve"> and </w:t>
-      </w:r>
-      <w:proofErr w:type="spellStart"/>
-      <w:r>
-        <w:t>promo_code_used</w:t>
-      </w:r>
-      <w:proofErr w:type="spellEnd"/>
-      <w:r>
-        <w:t xml:space="preserve"> was conducted. To streamline the schema and reduce feature redundancy, </w:t>
-      </w:r>
-      <w:proofErr w:type="spellStart"/>
-      <w:r>
-        <w:t>promo_code_used</w:t>
-      </w:r>
-      <w:proofErr w:type="spellEnd"/>
-      <w:r>
-        <w:t xml:space="preserve"> was dropped from the dataset.</w:t>
-      </w:r>
-    </w:p>
-    <w:p>
-      <w:r>
-        <w:pict w14:anchorId="534A148C">
-          <v:rect id="_x0000_i1027" style="width:0;height:1.5pt" o:hralign="center" o:hrstd="t" o:hr="t" fillcolor="#a0a0a0" stroked="f"/>
-        </w:pict>
-      </w:r>
-    </w:p>
-    <w:p>
-      <w:pPr>
-        <w:numPr>
-          <w:ilvl w:val="0"/>
-          <w:numId w:val="2"/>
-        </w:numPr>
+        <w:br w:type="page"/>
+      </w:r>
+    </w:p>
+    <w:p>
+      <w:pPr>
         <w:rPr>
           <w:b/>
           <w:bCs/>
@@ -1182,7 +558,198 @@
           <w:b/>
           <w:bCs/>
         </w:rPr>
-        <w:t>4. Database Integration &amp; Persistence</w:t>
+        <w:lastRenderedPageBreak/>
+        <w:t>Step 4: Categorical Mapping &amp; Numeric Conversion</w:t>
+      </w:r>
+    </w:p>
+    <w:p>
+      <w:r>
+        <w:t>The frequency_of_purchases feature contained textual purchase cadences. These string descriptors were mapped to numerical values representing cycle duration in days (purchase_frequency_days) to enable numerical modeling:</w:t>
+      </w:r>
+    </w:p>
+    <w:p>
+      <w:r>
+        <w:rPr>
+          <w:noProof/>
+        </w:rPr>
+        <w:drawing>
+          <wp:inline distT="0" distB="0" distL="0" distR="0" wp14:anchorId="78FD5FAB" wp14:editId="43A526B4">
+            <wp:extent cx="5943600" cy="5466715"/>
+            <wp:effectExtent l="0" t="0" r="0" b="635"/>
+            <wp:docPr id="861997267" name="Picture 1"/>
+            <wp:cNvGraphicFramePr>
+              <a:graphicFrameLocks xmlns:a="http://schemas.openxmlformats.org/drawingml/2006/main" noChangeAspect="1"/>
+            </wp:cNvGraphicFramePr>
+            <a:graphic xmlns:a="http://schemas.openxmlformats.org/drawingml/2006/main">
+              <a:graphicData uri="http://schemas.openxmlformats.org/drawingml/2006/picture">
+                <pic:pic xmlns:pic="http://schemas.openxmlformats.org/drawingml/2006/picture">
+                  <pic:nvPicPr>
+                    <pic:cNvPr id="861997267" name=""/>
+                    <pic:cNvPicPr/>
+                  </pic:nvPicPr>
+                  <pic:blipFill>
+                    <a:blip r:embed="rId9"/>
+                    <a:stretch>
+                      <a:fillRect/>
+                    </a:stretch>
+                  </pic:blipFill>
+                  <pic:spPr>
+                    <a:xfrm>
+                      <a:off x="0" y="0"/>
+                      <a:ext cx="5943600" cy="5466715"/>
+                    </a:xfrm>
+                    <a:prstGeom prst="rect">
+                      <a:avLst/>
+                    </a:prstGeom>
+                  </pic:spPr>
+                </pic:pic>
+              </a:graphicData>
+            </a:graphic>
+          </wp:inline>
+        </w:drawing>
+      </w:r>
+    </w:p>
+    <w:p>
+      <w:pPr>
+        <w:spacing w:after="160" w:line="278" w:lineRule="auto"/>
+        <w:jc w:val="left"/>
+      </w:pPr>
+      <w:r>
+        <w:br w:type="page"/>
+      </w:r>
+    </w:p>
+    <w:p>
+      <w:pPr>
+        <w:rPr>
+          <w:b/>
+          <w:bCs/>
+        </w:rPr>
+      </w:pPr>
+      <w:r>
+        <w:rPr>
+          <w:b/>
+          <w:bCs/>
+        </w:rPr>
+        <w:lastRenderedPageBreak/>
+        <w:t>Step 5: Redundancy Analysis &amp; Feature Elimination</w:t>
+      </w:r>
+    </w:p>
+    <w:p>
+      <w:r>
+        <w:t xml:space="preserve">A comparison between </w:t>
+      </w:r>
+      <w:proofErr w:type="spellStart"/>
+      <w:r>
+        <w:t>discount_applied</w:t>
+      </w:r>
+      <w:proofErr w:type="spellEnd"/>
+      <w:r>
+        <w:t xml:space="preserve"> and </w:t>
+      </w:r>
+      <w:proofErr w:type="spellStart"/>
+      <w:r>
+        <w:t>promo_code_used</w:t>
+      </w:r>
+      <w:proofErr w:type="spellEnd"/>
+      <w:r>
+        <w:t xml:space="preserve"> was conducted. To streamline the schema and reduce feature redundancy, </w:t>
+      </w:r>
+      <w:proofErr w:type="spellStart"/>
+      <w:r>
+        <w:t>promo_code_used</w:t>
+      </w:r>
+      <w:proofErr w:type="spellEnd"/>
+      <w:r>
+        <w:t xml:space="preserve"> was dropped from the dataset.</w:t>
+      </w:r>
+    </w:p>
+    <w:p>
+      <w:r>
+        <w:rPr>
+          <w:noProof/>
+        </w:rPr>
+        <w:drawing>
+          <wp:inline distT="0" distB="0" distL="0" distR="0" wp14:anchorId="758669F0" wp14:editId="7B72560F">
+            <wp:extent cx="5943600" cy="4549775"/>
+            <wp:effectExtent l="0" t="0" r="0" b="3175"/>
+            <wp:docPr id="1999961588" name="Picture 1"/>
+            <wp:cNvGraphicFramePr>
+              <a:graphicFrameLocks xmlns:a="http://schemas.openxmlformats.org/drawingml/2006/main" noChangeAspect="1"/>
+            </wp:cNvGraphicFramePr>
+            <a:graphic xmlns:a="http://schemas.openxmlformats.org/drawingml/2006/main">
+              <a:graphicData uri="http://schemas.openxmlformats.org/drawingml/2006/picture">
+                <pic:pic xmlns:pic="http://schemas.openxmlformats.org/drawingml/2006/picture">
+                  <pic:nvPicPr>
+                    <pic:cNvPr id="1999961588" name=""/>
+                    <pic:cNvPicPr/>
+                  </pic:nvPicPr>
+                  <pic:blipFill>
+                    <a:blip r:embed="rId10"/>
+                    <a:stretch>
+                      <a:fillRect/>
+                    </a:stretch>
+                  </pic:blipFill>
+                  <pic:spPr>
+                    <a:xfrm>
+                      <a:off x="0" y="0"/>
+                      <a:ext cx="5943600" cy="4549775"/>
+                    </a:xfrm>
+                    <a:prstGeom prst="rect">
+                      <a:avLst/>
+                    </a:prstGeom>
+                  </pic:spPr>
+                </pic:pic>
+              </a:graphicData>
+            </a:graphic>
+          </wp:inline>
+        </w:drawing>
+      </w:r>
+    </w:p>
+    <w:p>
+      <w:r>
+        <w:pict w14:anchorId="534A148C">
+          <v:rect id="_x0000_i1028" style="width:0;height:1.5pt" o:hralign="center" o:hrstd="t" o:hr="t" fillcolor="#a0a0a0" stroked="f"/>
+        </w:pict>
+      </w:r>
+    </w:p>
+    <w:p>
+      <w:pPr>
+        <w:spacing w:after="160" w:line="278" w:lineRule="auto"/>
+        <w:jc w:val="left"/>
+        <w:rPr>
+          <w:b/>
+          <w:bCs/>
+        </w:rPr>
+      </w:pPr>
+      <w:r>
+        <w:rPr>
+          <w:b/>
+          <w:bCs/>
+        </w:rPr>
+        <w:br w:type="page"/>
+      </w:r>
+    </w:p>
+    <w:p>
+      <w:pPr>
+        <w:rPr>
+          <w:b/>
+          <w:bCs/>
+        </w:rPr>
+      </w:pPr>
+      <w:r>
+        <w:rPr>
+          <w:b/>
+          <w:bCs/>
+        </w:rPr>
+        <w:lastRenderedPageBreak/>
+        <w:t>Step 6</w:t>
+      </w:r>
+      <w:r>
+        <w:rPr>
+          <w:b/>
+          <w:bCs/>
+        </w:rPr>
+        <w:t>. Database Integration &amp; Persistence</w:t>
       </w:r>
     </w:p>
     <w:p>
@@ -1307,234 +874,1182 @@
       </w:r>
       <w:proofErr w:type="spellEnd"/>
       <w:r>
-        <w:t xml:space="preserve"> and </w:t>
-      </w:r>
-      <w:proofErr w:type="spellStart"/>
-      <w:r>
-        <w:t>purchase_frequency_days</w:t>
-      </w:r>
-      <w:proofErr w:type="spellEnd"/>
-      <w:r>
-        <w:t>).</w:t>
+        <w:t xml:space="preserve"> and purchase_frequency_days).</w:t>
+      </w:r>
+    </w:p>
+    <w:p>
+      <w:pPr>
+        <w:ind w:left="720"/>
+      </w:pPr>
+      <w:r>
+        <w:rPr>
+          <w:noProof/>
+        </w:rPr>
+        <w:drawing>
+          <wp:inline distT="0" distB="0" distL="0" distR="0" wp14:anchorId="0B53EDFF" wp14:editId="5E9E05FF">
+            <wp:extent cx="5943600" cy="2635250"/>
+            <wp:effectExtent l="0" t="0" r="0" b="0"/>
+            <wp:docPr id="220677960" name="Picture 1"/>
+            <wp:cNvGraphicFramePr>
+              <a:graphicFrameLocks xmlns:a="http://schemas.openxmlformats.org/drawingml/2006/main" noChangeAspect="1"/>
+            </wp:cNvGraphicFramePr>
+            <a:graphic xmlns:a="http://schemas.openxmlformats.org/drawingml/2006/main">
+              <a:graphicData uri="http://schemas.openxmlformats.org/drawingml/2006/picture">
+                <pic:pic xmlns:pic="http://schemas.openxmlformats.org/drawingml/2006/picture">
+                  <pic:nvPicPr>
+                    <pic:cNvPr id="220677960" name=""/>
+                    <pic:cNvPicPr/>
+                  </pic:nvPicPr>
+                  <pic:blipFill>
+                    <a:blip r:embed="rId11"/>
+                    <a:stretch>
+                      <a:fillRect/>
+                    </a:stretch>
+                  </pic:blipFill>
+                  <pic:spPr>
+                    <a:xfrm>
+                      <a:off x="0" y="0"/>
+                      <a:ext cx="5943600" cy="2635250"/>
+                    </a:xfrm>
+                    <a:prstGeom prst="rect">
+                      <a:avLst/>
+                    </a:prstGeom>
+                  </pic:spPr>
+                </pic:pic>
+              </a:graphicData>
+            </a:graphic>
+          </wp:inline>
+        </w:drawing>
       </w:r>
     </w:p>
     <w:p>
       <w:r>
         <w:pict w14:anchorId="5C031699">
-          <v:rect id="_x0000_i1028" style="width:0;height:1.5pt" o:hralign="center" o:hrstd="t" o:hr="t" fillcolor="#a0a0a0" stroked="f"/>
+          <v:rect id="_x0000_i1029" style="width:0;height:1.5pt" o:hralign="center" o:hrstd="t" o:hr="t" fillcolor="#a0a0a0" stroked="f"/>
         </w:pict>
       </w:r>
     </w:p>
     <w:p>
       <w:pPr>
+        <w:spacing w:after="160" w:line="278" w:lineRule="auto"/>
+        <w:jc w:val="left"/>
+      </w:pPr>
+      <w:r>
+        <w:br w:type="page"/>
+      </w:r>
+    </w:p>
+    <w:p>
+      <w:pPr>
+        <w:pStyle w:val="Heading2"/>
+      </w:pPr>
+      <w:r>
+        <w:lastRenderedPageBreak/>
+        <w:t xml:space="preserve"> </w:t>
+      </w:r>
+      <w:r>
+        <w:t>Data Analysis using SQL</w:t>
+      </w:r>
+    </w:p>
+    <w:p>
+      <w:pPr>
+        <w:ind w:left="720"/>
+        <w:rPr>
+          <w:sz w:val="24"/>
+          <w:szCs w:val="24"/>
+        </w:rPr>
+      </w:pPr>
+      <w:r>
+        <w:rPr>
+          <w:sz w:val="24"/>
+          <w:szCs w:val="24"/>
+        </w:rPr>
+        <w:t>The structured analysis performed in PostgreSQL to answer the business questions:</w:t>
+      </w:r>
+    </w:p>
+    <w:p>
+      <w:pPr>
+        <w:pStyle w:val="ListParagraph"/>
+      </w:pPr>
+      <w:r>
+        <w:t xml:space="preserve">Revenue by gender: </w:t>
+      </w:r>
+      <w:r>
+        <w:rPr>
+          <w:b w:val="0"/>
+          <w:bCs w:val="0"/>
+        </w:rPr>
+        <w:t>The total revenue generated through  the male and the female customers is compared.</w:t>
+      </w:r>
+    </w:p>
+    <w:p>
+      <w:pPr>
+        <w:ind w:left="1440"/>
+      </w:pPr>
+      <w:r>
+        <w:rPr>
+          <w:noProof/>
+        </w:rPr>
+        <w:drawing>
+          <wp:inline distT="0" distB="0" distL="0" distR="0" wp14:anchorId="05AC578E" wp14:editId="1CE40966">
+            <wp:extent cx="1752845" cy="866896"/>
+            <wp:effectExtent l="0" t="0" r="0" b="9525"/>
+            <wp:docPr id="27055622" name="Picture 1"/>
+            <wp:cNvGraphicFramePr>
+              <a:graphicFrameLocks xmlns:a="http://schemas.openxmlformats.org/drawingml/2006/main" noChangeAspect="1"/>
+            </wp:cNvGraphicFramePr>
+            <a:graphic xmlns:a="http://schemas.openxmlformats.org/drawingml/2006/main">
+              <a:graphicData uri="http://schemas.openxmlformats.org/drawingml/2006/picture">
+                <pic:pic xmlns:pic="http://schemas.openxmlformats.org/drawingml/2006/picture">
+                  <pic:nvPicPr>
+                    <pic:cNvPr id="27055622" name=""/>
+                    <pic:cNvPicPr/>
+                  </pic:nvPicPr>
+                  <pic:blipFill>
+                    <a:blip r:embed="rId12"/>
+                    <a:stretch>
+                      <a:fillRect/>
+                    </a:stretch>
+                  </pic:blipFill>
+                  <pic:spPr>
+                    <a:xfrm>
+                      <a:off x="0" y="0"/>
+                      <a:ext cx="1752845" cy="866896"/>
+                    </a:xfrm>
+                    <a:prstGeom prst="rect">
+                      <a:avLst/>
+                    </a:prstGeom>
+                  </pic:spPr>
+                </pic:pic>
+              </a:graphicData>
+            </a:graphic>
+          </wp:inline>
+        </w:drawing>
+      </w:r>
+    </w:p>
+    <w:p>
+      <w:pPr>
+        <w:spacing w:after="160" w:line="278" w:lineRule="auto"/>
+        <w:jc w:val="left"/>
+      </w:pPr>
+    </w:p>
+    <w:p>
+      <w:pPr>
+        <w:pStyle w:val="ListParagraph"/>
+      </w:pPr>
+      <w:r>
+        <w:t xml:space="preserve">High-Spending Discount Users: </w:t>
+      </w:r>
+      <w:r>
+        <w:rPr>
+          <w:b w:val="0"/>
+          <w:bCs w:val="0"/>
+        </w:rPr>
+        <w:t>Identified the customers who used the discounts but still spends above the average purchase amount</w:t>
+      </w:r>
+    </w:p>
+    <w:p>
+      <w:pPr>
+        <w:pStyle w:val="ListParagraph"/>
         <w:numPr>
           <w:ilvl w:val="0"/>
-          <w:numId w:val="2"/>
+          <w:numId w:val="0"/>
         </w:numPr>
-        <w:rPr>
-          <w:b/>
-          <w:bCs/>
-        </w:rPr>
-      </w:pPr>
-      <w:r>
-        <w:rPr>
-          <w:b/>
-          <w:bCs/>
-        </w:rPr>
-        <w:t>5. Summary of Outcomes</w:t>
-      </w:r>
-    </w:p>
-    <w:p>
-      <w:pPr>
+        <w:ind w:left="1440"/>
+      </w:pPr>
+      <w:r>
+        <w:rPr>
+          <w:noProof/>
+        </w:rPr>
+        <w:drawing>
+          <wp:inline distT="0" distB="0" distL="0" distR="0" wp14:anchorId="67C59CE9" wp14:editId="23217608">
+            <wp:extent cx="3296110" cy="4963218"/>
+            <wp:effectExtent l="0" t="0" r="0" b="8890"/>
+            <wp:docPr id="997938252" name="Picture 1"/>
+            <wp:cNvGraphicFramePr>
+              <a:graphicFrameLocks xmlns:a="http://schemas.openxmlformats.org/drawingml/2006/main" noChangeAspect="1"/>
+            </wp:cNvGraphicFramePr>
+            <a:graphic xmlns:a="http://schemas.openxmlformats.org/drawingml/2006/main">
+              <a:graphicData uri="http://schemas.openxmlformats.org/drawingml/2006/picture">
+                <pic:pic xmlns:pic="http://schemas.openxmlformats.org/drawingml/2006/picture">
+                  <pic:nvPicPr>
+                    <pic:cNvPr id="997938252" name=""/>
+                    <pic:cNvPicPr/>
+                  </pic:nvPicPr>
+                  <pic:blipFill>
+                    <a:blip r:embed="rId13"/>
+                    <a:stretch>
+                      <a:fillRect/>
+                    </a:stretch>
+                  </pic:blipFill>
+                  <pic:spPr>
+                    <a:xfrm>
+                      <a:off x="0" y="0"/>
+                      <a:ext cx="3296110" cy="4963218"/>
+                    </a:xfrm>
+                    <a:prstGeom prst="rect">
+                      <a:avLst/>
+                    </a:prstGeom>
+                  </pic:spPr>
+                </pic:pic>
+              </a:graphicData>
+            </a:graphic>
+          </wp:inline>
+        </w:drawing>
+      </w:r>
+    </w:p>
+    <w:p>
+      <w:pPr>
+        <w:pStyle w:val="ListParagraph"/>
+        <w:rPr>
+          <w:b w:val="0"/>
+          <w:bCs w:val="0"/>
+        </w:rPr>
+      </w:pPr>
+      <w:r>
+        <w:lastRenderedPageBreak/>
+        <w:t xml:space="preserve">Highly Rated products: </w:t>
+      </w:r>
+      <w:r>
+        <w:rPr>
+          <w:b w:val="0"/>
+          <w:bCs w:val="0"/>
+        </w:rPr>
+        <w:t>Searched and found the products that are highly rated</w:t>
+      </w:r>
+      <w:r>
+        <w:rPr>
+          <w:b w:val="0"/>
+          <w:bCs w:val="0"/>
+        </w:rPr>
+        <w:t>.</w:t>
+      </w:r>
+    </w:p>
+    <w:p>
+      <w:pPr>
+        <w:pStyle w:val="ListParagraph"/>
         <w:numPr>
           <w:ilvl w:val="0"/>
-          <w:numId w:val="5"/>
+          <w:numId w:val="0"/>
         </w:numPr>
-      </w:pPr>
-      <w:r>
-        <w:rPr>
-          <w:b/>
-          <w:bCs/>
-        </w:rPr>
-        <w:t>Completeness:</w:t>
-      </w:r>
-      <w:r>
-        <w:t xml:space="preserve"> Imputed 100% of missing values (37 missing ratings resolved).</w:t>
-      </w:r>
-    </w:p>
-    <w:p>
-      <w:pPr>
+        <w:ind w:left="1440"/>
+        <w:rPr>
+          <w:b w:val="0"/>
+          <w:bCs w:val="0"/>
+        </w:rPr>
+      </w:pPr>
+      <w:r>
+        <w:rPr>
+          <w:b w:val="0"/>
+          <w:bCs w:val="0"/>
+          <w:noProof/>
+        </w:rPr>
+        <w:drawing>
+          <wp:inline distT="0" distB="0" distL="0" distR="0" wp14:anchorId="0AFD0FE7" wp14:editId="2957C37F">
+            <wp:extent cx="3029373" cy="1609950"/>
+            <wp:effectExtent l="0" t="0" r="0" b="9525"/>
+            <wp:docPr id="89592643" name="Picture 1"/>
+            <wp:cNvGraphicFramePr>
+              <a:graphicFrameLocks xmlns:a="http://schemas.openxmlformats.org/drawingml/2006/main" noChangeAspect="1"/>
+            </wp:cNvGraphicFramePr>
+            <a:graphic xmlns:a="http://schemas.openxmlformats.org/drawingml/2006/main">
+              <a:graphicData uri="http://schemas.openxmlformats.org/drawingml/2006/picture">
+                <pic:pic xmlns:pic="http://schemas.openxmlformats.org/drawingml/2006/picture">
+                  <pic:nvPicPr>
+                    <pic:cNvPr id="89592643" name=""/>
+                    <pic:cNvPicPr/>
+                  </pic:nvPicPr>
+                  <pic:blipFill>
+                    <a:blip r:embed="rId14"/>
+                    <a:stretch>
+                      <a:fillRect/>
+                    </a:stretch>
+                  </pic:blipFill>
+                  <pic:spPr>
+                    <a:xfrm>
+                      <a:off x="0" y="0"/>
+                      <a:ext cx="3029373" cy="1609950"/>
+                    </a:xfrm>
+                    <a:prstGeom prst="rect">
+                      <a:avLst/>
+                    </a:prstGeom>
+                  </pic:spPr>
+                </pic:pic>
+              </a:graphicData>
+            </a:graphic>
+          </wp:inline>
+        </w:drawing>
+      </w:r>
+    </w:p>
+    <w:p>
+      <w:pPr>
+        <w:pStyle w:val="ListParagraph"/>
+      </w:pPr>
+      <w:r>
+        <w:t xml:space="preserve">Shipping Type Comparison: </w:t>
+      </w:r>
+      <w:r>
+        <w:rPr>
+          <w:b w:val="0"/>
+          <w:bCs w:val="0"/>
+        </w:rPr>
+        <w:t>Compared the average the purchase amounts between Standard and Express shipping</w:t>
+      </w:r>
+      <w:r>
+        <w:rPr>
+          <w:b w:val="0"/>
+          <w:bCs w:val="0"/>
+        </w:rPr>
+        <w:t>.</w:t>
+      </w:r>
+    </w:p>
+    <w:p>
+      <w:pPr>
+        <w:pStyle w:val="ListParagraph"/>
         <w:numPr>
           <w:ilvl w:val="0"/>
-          <w:numId w:val="5"/>
+          <w:numId w:val="0"/>
         </w:numPr>
-      </w:pPr>
-      <w:r>
-        <w:rPr>
-          <w:b/>
-          <w:bCs/>
-        </w:rPr>
-        <w:t>Schema Standardization:</w:t>
-      </w:r>
-      <w:r>
-        <w:t xml:space="preserve"> Standardized headers into </w:t>
-      </w:r>
-      <w:proofErr w:type="spellStart"/>
-      <w:r>
-        <w:t>snake_case</w:t>
-      </w:r>
-      <w:proofErr w:type="spellEnd"/>
-      <w:r>
-        <w:t xml:space="preserve"> PostgreSQL compliance.</w:t>
-      </w:r>
-    </w:p>
-    <w:p>
-      <w:pPr>
+        <w:ind w:left="1440"/>
+      </w:pPr>
+      <w:r>
+        <w:rPr>
+          <w:noProof/>
+        </w:rPr>
+        <w:drawing>
+          <wp:inline distT="0" distB="0" distL="0" distR="0" wp14:anchorId="7610E4B8" wp14:editId="012350F2">
+            <wp:extent cx="2124371" cy="924054"/>
+            <wp:effectExtent l="0" t="0" r="0" b="9525"/>
+            <wp:docPr id="214358477" name="Picture 1"/>
+            <wp:cNvGraphicFramePr>
+              <a:graphicFrameLocks xmlns:a="http://schemas.openxmlformats.org/drawingml/2006/main" noChangeAspect="1"/>
+            </wp:cNvGraphicFramePr>
+            <a:graphic xmlns:a="http://schemas.openxmlformats.org/drawingml/2006/main">
+              <a:graphicData uri="http://schemas.openxmlformats.org/drawingml/2006/picture">
+                <pic:pic xmlns:pic="http://schemas.openxmlformats.org/drawingml/2006/picture">
+                  <pic:nvPicPr>
+                    <pic:cNvPr id="214358477" name=""/>
+                    <pic:cNvPicPr/>
+                  </pic:nvPicPr>
+                  <pic:blipFill>
+                    <a:blip r:embed="rId15"/>
+                    <a:stretch>
+                      <a:fillRect/>
+                    </a:stretch>
+                  </pic:blipFill>
+                  <pic:spPr>
+                    <a:xfrm>
+                      <a:off x="0" y="0"/>
+                      <a:ext cx="2124371" cy="924054"/>
+                    </a:xfrm>
+                    <a:prstGeom prst="rect">
+                      <a:avLst/>
+                    </a:prstGeom>
+                  </pic:spPr>
+                </pic:pic>
+              </a:graphicData>
+            </a:graphic>
+          </wp:inline>
+        </w:drawing>
+      </w:r>
+    </w:p>
+    <w:p>
+      <w:pPr>
+        <w:pStyle w:val="ListParagraph"/>
+      </w:pPr>
+      <w:r>
+        <w:t xml:space="preserve">Subscriber vs Non-Subscribers: </w:t>
+      </w:r>
+      <w:r>
+        <w:rPr>
+          <w:b w:val="0"/>
+          <w:bCs w:val="0"/>
+        </w:rPr>
+        <w:t>Compared the average spend and total revenue across subscription status</w:t>
+      </w:r>
+      <w:r>
+        <w:rPr>
+          <w:b w:val="0"/>
+          <w:bCs w:val="0"/>
+        </w:rPr>
+        <w:t xml:space="preserve"> to see if the subscribed  customer </w:t>
+      </w:r>
+      <w:proofErr w:type="gramStart"/>
+      <w:r>
+        <w:rPr>
+          <w:b w:val="0"/>
+          <w:bCs w:val="0"/>
+        </w:rPr>
+        <w:t>spend</w:t>
+      </w:r>
+      <w:proofErr w:type="gramEnd"/>
+      <w:r>
+        <w:rPr>
+          <w:b w:val="0"/>
+          <w:bCs w:val="0"/>
+        </w:rPr>
+        <w:t xml:space="preserve"> more.</w:t>
+      </w:r>
+    </w:p>
+    <w:p>
+      <w:pPr>
+        <w:pStyle w:val="ListParagraph"/>
         <w:numPr>
           <w:ilvl w:val="0"/>
-          <w:numId w:val="5"/>
+          <w:numId w:val="0"/>
         </w:numPr>
-      </w:pPr>
-      <w:r>
-        <w:rPr>
-          <w:b/>
-          <w:bCs/>
-        </w:rPr>
-        <w:lastRenderedPageBreak/>
-        <w:t>Feature Value-Add:</w:t>
-      </w:r>
-      <w:r>
-        <w:t xml:space="preserve"> Added 2 engineered columns (</w:t>
-      </w:r>
-      <w:proofErr w:type="spellStart"/>
-      <w:r>
-        <w:t>age_group</w:t>
-      </w:r>
-      <w:proofErr w:type="spellEnd"/>
-      <w:r>
-        <w:t xml:space="preserve"> and </w:t>
-      </w:r>
-      <w:proofErr w:type="spellStart"/>
-      <w:r>
-        <w:t>purchase_frequency_days</w:t>
-      </w:r>
-      <w:proofErr w:type="spellEnd"/>
-      <w:r>
-        <w:t>) while removing 1 redundant feature (</w:t>
-      </w:r>
-      <w:proofErr w:type="spellStart"/>
-      <w:r>
-        <w:t>promo_code_used</w:t>
-      </w:r>
-      <w:proofErr w:type="spellEnd"/>
-      <w:r>
-        <w:t>).</w:t>
-      </w:r>
-    </w:p>
-    <w:p>
-      <w:pPr>
+        <w:ind w:left="1440"/>
+      </w:pPr>
+      <w:r>
+        <w:rPr>
+          <w:noProof/>
+        </w:rPr>
+        <w:drawing>
+          <wp:inline distT="0" distB="0" distL="0" distR="0" wp14:anchorId="26552EAE" wp14:editId="2CEC818F">
+            <wp:extent cx="4582164" cy="933580"/>
+            <wp:effectExtent l="0" t="0" r="8890" b="0"/>
+            <wp:docPr id="1016487210" name="Picture 1"/>
+            <wp:cNvGraphicFramePr>
+              <a:graphicFrameLocks xmlns:a="http://schemas.openxmlformats.org/drawingml/2006/main" noChangeAspect="1"/>
+            </wp:cNvGraphicFramePr>
+            <a:graphic xmlns:a="http://schemas.openxmlformats.org/drawingml/2006/main">
+              <a:graphicData uri="http://schemas.openxmlformats.org/drawingml/2006/picture">
+                <pic:pic xmlns:pic="http://schemas.openxmlformats.org/drawingml/2006/picture">
+                  <pic:nvPicPr>
+                    <pic:cNvPr id="1016487210" name=""/>
+                    <pic:cNvPicPr/>
+                  </pic:nvPicPr>
+                  <pic:blipFill>
+                    <a:blip r:embed="rId16"/>
+                    <a:stretch>
+                      <a:fillRect/>
+                    </a:stretch>
+                  </pic:blipFill>
+                  <pic:spPr>
+                    <a:xfrm>
+                      <a:off x="0" y="0"/>
+                      <a:ext cx="4582164" cy="933580"/>
+                    </a:xfrm>
+                    <a:prstGeom prst="rect">
+                      <a:avLst/>
+                    </a:prstGeom>
+                  </pic:spPr>
+                </pic:pic>
+              </a:graphicData>
+            </a:graphic>
+          </wp:inline>
+        </w:drawing>
+      </w:r>
+    </w:p>
+    <w:p>
+      <w:pPr>
+        <w:pStyle w:val="ListParagraph"/>
         <w:numPr>
           <w:ilvl w:val="0"/>
-          <w:numId w:val="5"/>
+          <w:numId w:val="0"/>
         </w:numPr>
-      </w:pPr>
-      <w:r>
-        <w:rPr>
-          <w:b/>
-          <w:bCs/>
-        </w:rPr>
-        <w:t>Production Readiness:</w:t>
-      </w:r>
-      <w:r>
-        <w:t xml:space="preserve"> Full pipeline successfully executed and persisted directly into a PostgreSQL database table for downstream SQL querying.</w:t>
-      </w:r>
-    </w:p>
-    <w:p>
-      <w:r>
-        <w:pict w14:anchorId="7D86E051">
-          <v:rect id="_x0000_i1029" style="width:0;height:1.5pt" o:hralign="center" o:hrstd="t" o:hr="t" fillcolor="#a0a0a0" stroked="f"/>
-        </w:pict>
-      </w:r>
-    </w:p>
-    <w:p>
-      <w:pPr>
-        <w:pStyle w:val="Heading2"/>
-      </w:pPr>
-      <w:r>
-        <w:t>6. Business Recommendations</w:t>
-      </w:r>
-    </w:p>
-    <w:p>
-      <w:pPr>
+        <w:ind w:left="1440"/>
+      </w:pPr>
+    </w:p>
+    <w:p>
+      <w:pPr>
+        <w:pStyle w:val="ListParagraph"/>
+        <w:rPr>
+          <w:b w:val="0"/>
+          <w:bCs w:val="0"/>
+        </w:rPr>
+      </w:pPr>
+      <w:r>
+        <w:t xml:space="preserve">Discount-Dependent Products: </w:t>
+      </w:r>
+      <w:r>
+        <w:rPr>
+          <w:b w:val="0"/>
+          <w:bCs w:val="0"/>
+        </w:rPr>
+        <w:t>Searched for top  5 products have the highest percentage of purchases with discount.</w:t>
+      </w:r>
+    </w:p>
+    <w:p>
+      <w:pPr>
+        <w:pStyle w:val="ListParagraph"/>
         <w:numPr>
           <w:ilvl w:val="0"/>
-          <w:numId w:val="6"/>
+          <w:numId w:val="0"/>
         </w:numPr>
-      </w:pPr>
-      <w:r>
-        <w:rPr>
-          <w:b/>
-          <w:bCs/>
-        </w:rPr>
-        <w:t>Targeted Retargeting by Age Group:</w:t>
-      </w:r>
-      <w:r>
-        <w:t xml:space="preserve"> Leverage the newly engineered </w:t>
-      </w:r>
-      <w:proofErr w:type="spellStart"/>
-      <w:r>
-        <w:t>age_group</w:t>
-      </w:r>
-      <w:proofErr w:type="spellEnd"/>
-      <w:r>
-        <w:t xml:space="preserve"> categories to run age-tailored promotions (e.g., trend-focused campaigns for Young Adults vs. loyalty benefits for Senior buyers).</w:t>
-      </w:r>
-    </w:p>
-    <w:p>
-      <w:pPr>
+        <w:ind w:left="1440"/>
+        <w:rPr>
+          <w:b w:val="0"/>
+          <w:bCs w:val="0"/>
+        </w:rPr>
+      </w:pPr>
+      <w:r>
+        <w:rPr>
+          <w:b w:val="0"/>
+          <w:bCs w:val="0"/>
+          <w:noProof/>
+        </w:rPr>
+        <w:drawing>
+          <wp:inline distT="0" distB="0" distL="0" distR="0" wp14:anchorId="3FA5DAD5" wp14:editId="58C8EF20">
+            <wp:extent cx="2562583" cy="1638529"/>
+            <wp:effectExtent l="0" t="0" r="9525" b="0"/>
+            <wp:docPr id="1340715287" name="Picture 1"/>
+            <wp:cNvGraphicFramePr>
+              <a:graphicFrameLocks xmlns:a="http://schemas.openxmlformats.org/drawingml/2006/main" noChangeAspect="1"/>
+            </wp:cNvGraphicFramePr>
+            <a:graphic xmlns:a="http://schemas.openxmlformats.org/drawingml/2006/main">
+              <a:graphicData uri="http://schemas.openxmlformats.org/drawingml/2006/picture">
+                <pic:pic xmlns:pic="http://schemas.openxmlformats.org/drawingml/2006/picture">
+                  <pic:nvPicPr>
+                    <pic:cNvPr id="1340715287" name=""/>
+                    <pic:cNvPicPr/>
+                  </pic:nvPicPr>
+                  <pic:blipFill>
+                    <a:blip r:embed="rId17"/>
+                    <a:stretch>
+                      <a:fillRect/>
+                    </a:stretch>
+                  </pic:blipFill>
+                  <pic:spPr>
+                    <a:xfrm>
+                      <a:off x="0" y="0"/>
+                      <a:ext cx="2562583" cy="1638529"/>
+                    </a:xfrm>
+                    <a:prstGeom prst="rect">
+                      <a:avLst/>
+                    </a:prstGeom>
+                  </pic:spPr>
+                </pic:pic>
+              </a:graphicData>
+            </a:graphic>
+          </wp:inline>
+        </w:drawing>
+      </w:r>
+    </w:p>
+    <w:p>
+      <w:pPr>
+        <w:pStyle w:val="ListParagraph"/>
+      </w:pPr>
+      <w:r>
+        <w:lastRenderedPageBreak/>
+        <w:t xml:space="preserve">Categorizing the customers: </w:t>
+      </w:r>
+      <w:r>
+        <w:rPr>
+          <w:b w:val="0"/>
+          <w:bCs w:val="0"/>
+        </w:rPr>
+        <w:t>Segmenting the customers into new, returning and loyal group according to the total number of previous purchases.</w:t>
+      </w:r>
+    </w:p>
+    <w:p>
+      <w:pPr>
+        <w:pStyle w:val="ListParagraph"/>
         <w:numPr>
           <w:ilvl w:val="0"/>
-          <w:numId w:val="6"/>
+          <w:numId w:val="0"/>
         </w:numPr>
-      </w:pPr>
-      <w:r>
-        <w:rPr>
-          <w:b/>
-          <w:bCs/>
-        </w:rPr>
-        <w:t>Purchase Cycle Automation:</w:t>
-      </w:r>
-      <w:r>
-        <w:t xml:space="preserve"> Utilize </w:t>
-      </w:r>
-      <w:proofErr w:type="spellStart"/>
-      <w:r>
-        <w:t>purchase_frequency_days</w:t>
-      </w:r>
-      <w:proofErr w:type="spellEnd"/>
-      <w:r>
-        <w:t xml:space="preserve"> to set up automated email reminders slightly ahead of scheduled repurchase windows (e.g., sent every 12 days for Fortnightly shoppers).</w:t>
-      </w:r>
-    </w:p>
-    <w:p>
-      <w:pPr>
+        <w:ind w:left="1440"/>
+      </w:pPr>
+      <w:r>
+        <w:rPr>
+          <w:noProof/>
+        </w:rPr>
+        <w:drawing>
+          <wp:inline distT="0" distB="0" distL="0" distR="0" wp14:anchorId="62B9572F" wp14:editId="7B529065">
+            <wp:extent cx="3038899" cy="1076475"/>
+            <wp:effectExtent l="0" t="0" r="9525" b="9525"/>
+            <wp:docPr id="801837258" name="Picture 1"/>
+            <wp:cNvGraphicFramePr>
+              <a:graphicFrameLocks xmlns:a="http://schemas.openxmlformats.org/drawingml/2006/main" noChangeAspect="1"/>
+            </wp:cNvGraphicFramePr>
+            <a:graphic xmlns:a="http://schemas.openxmlformats.org/drawingml/2006/main">
+              <a:graphicData uri="http://schemas.openxmlformats.org/drawingml/2006/picture">
+                <pic:pic xmlns:pic="http://schemas.openxmlformats.org/drawingml/2006/picture">
+                  <pic:nvPicPr>
+                    <pic:cNvPr id="801837258" name=""/>
+                    <pic:cNvPicPr/>
+                  </pic:nvPicPr>
+                  <pic:blipFill>
+                    <a:blip r:embed="rId18"/>
+                    <a:stretch>
+                      <a:fillRect/>
+                    </a:stretch>
+                  </pic:blipFill>
+                  <pic:spPr>
+                    <a:xfrm>
+                      <a:off x="0" y="0"/>
+                      <a:ext cx="3038899" cy="1076475"/>
+                    </a:xfrm>
+                    <a:prstGeom prst="rect">
+                      <a:avLst/>
+                    </a:prstGeom>
+                  </pic:spPr>
+                </pic:pic>
+              </a:graphicData>
+            </a:graphic>
+          </wp:inline>
+        </w:drawing>
+      </w:r>
+    </w:p>
+    <w:p/>
+    <w:p>
+      <w:pPr>
+        <w:pStyle w:val="ListParagraph"/>
+      </w:pPr>
+      <w:r>
+        <w:t xml:space="preserve">Top 3 most purchased products in each category: </w:t>
+      </w:r>
+      <w:r>
+        <w:rPr>
+          <w:b w:val="0"/>
+          <w:bCs w:val="0"/>
+        </w:rPr>
+        <w:t>Finding the</w:t>
+      </w:r>
+      <w:r>
+        <w:t xml:space="preserve"> </w:t>
+      </w:r>
+      <w:r>
+        <w:rPr>
+          <w:b w:val="0"/>
+          <w:bCs w:val="0"/>
+        </w:rPr>
+        <w:t>most purchased products in each category to find the trend in the products.</w:t>
+      </w:r>
+    </w:p>
+    <w:p>
+      <w:pPr>
+        <w:pStyle w:val="ListParagraph"/>
         <w:numPr>
           <w:ilvl w:val="0"/>
-          <w:numId w:val="6"/>
+          <w:numId w:val="0"/>
         </w:numPr>
-      </w:pPr>
-      <w:r>
-        <w:rPr>
-          <w:b/>
+        <w:ind w:left="1440"/>
+      </w:pPr>
+      <w:r>
+        <w:rPr>
+          <w:noProof/>
+        </w:rPr>
+        <w:drawing>
+          <wp:inline distT="0" distB="0" distL="0" distR="0" wp14:anchorId="17D8F76A" wp14:editId="79985686">
+            <wp:extent cx="3953427" cy="2934109"/>
+            <wp:effectExtent l="0" t="0" r="9525" b="0"/>
+            <wp:docPr id="272444725" name="Picture 1"/>
+            <wp:cNvGraphicFramePr>
+              <a:graphicFrameLocks xmlns:a="http://schemas.openxmlformats.org/drawingml/2006/main" noChangeAspect="1"/>
+            </wp:cNvGraphicFramePr>
+            <a:graphic xmlns:a="http://schemas.openxmlformats.org/drawingml/2006/main">
+              <a:graphicData uri="http://schemas.openxmlformats.org/drawingml/2006/picture">
+                <pic:pic xmlns:pic="http://schemas.openxmlformats.org/drawingml/2006/picture">
+                  <pic:nvPicPr>
+                    <pic:cNvPr id="272444725" name=""/>
+                    <pic:cNvPicPr/>
+                  </pic:nvPicPr>
+                  <pic:blipFill>
+                    <a:blip r:embed="rId19"/>
+                    <a:stretch>
+                      <a:fillRect/>
+                    </a:stretch>
+                  </pic:blipFill>
+                  <pic:spPr>
+                    <a:xfrm>
+                      <a:off x="0" y="0"/>
+                      <a:ext cx="3953427" cy="2934109"/>
+                    </a:xfrm>
+                    <a:prstGeom prst="rect">
+                      <a:avLst/>
+                    </a:prstGeom>
+                  </pic:spPr>
+                </pic:pic>
+              </a:graphicData>
+            </a:graphic>
+          </wp:inline>
+        </w:drawing>
+      </w:r>
+    </w:p>
+    <w:p>
+      <w:pPr>
+        <w:pStyle w:val="ListParagraph"/>
+        <w:numPr>
+          <w:ilvl w:val="0"/>
+          <w:numId w:val="0"/>
+        </w:numPr>
+        <w:ind w:left="1440"/>
+      </w:pPr>
+    </w:p>
+    <w:p>
+      <w:pPr>
+        <w:pStyle w:val="ListParagraph"/>
+        <w:rPr>
+          <w:b w:val="0"/>
+          <w:bCs w:val="0"/>
+        </w:rPr>
+      </w:pPr>
+      <w:r>
+        <w:t xml:space="preserve">Subscription trend: </w:t>
+      </w:r>
+      <w:r>
+        <w:rPr>
+          <w:b w:val="0"/>
+          <w:bCs w:val="0"/>
+        </w:rPr>
+        <w:t>Finding the subscription trend in the repeat buyers.</w:t>
+      </w:r>
+    </w:p>
+    <w:p>
+      <w:pPr>
+        <w:pStyle w:val="ListParagraph"/>
+        <w:numPr>
+          <w:ilvl w:val="0"/>
+          <w:numId w:val="0"/>
+        </w:numPr>
+        <w:ind w:left="1440"/>
+        <w:rPr>
+          <w:b w:val="0"/>
+          <w:bCs w:val="0"/>
+        </w:rPr>
+      </w:pPr>
+      <w:r>
+        <w:rPr>
+          <w:b w:val="0"/>
+          <w:bCs w:val="0"/>
+          <w:noProof/>
+        </w:rPr>
+        <w:drawing>
+          <wp:inline distT="0" distB="0" distL="0" distR="0" wp14:anchorId="66FAB0DF" wp14:editId="3A603F31">
+            <wp:extent cx="2629267" cy="800212"/>
+            <wp:effectExtent l="0" t="0" r="0" b="0"/>
+            <wp:docPr id="2146316953" name="Picture 1"/>
+            <wp:cNvGraphicFramePr>
+              <a:graphicFrameLocks xmlns:a="http://schemas.openxmlformats.org/drawingml/2006/main" noChangeAspect="1"/>
+            </wp:cNvGraphicFramePr>
+            <a:graphic xmlns:a="http://schemas.openxmlformats.org/drawingml/2006/main">
+              <a:graphicData uri="http://schemas.openxmlformats.org/drawingml/2006/picture">
+                <pic:pic xmlns:pic="http://schemas.openxmlformats.org/drawingml/2006/picture">
+                  <pic:nvPicPr>
+                    <pic:cNvPr id="2146316953" name=""/>
+                    <pic:cNvPicPr/>
+                  </pic:nvPicPr>
+                  <pic:blipFill>
+                    <a:blip r:embed="rId20"/>
+                    <a:stretch>
+                      <a:fillRect/>
+                    </a:stretch>
+                  </pic:blipFill>
+                  <pic:spPr>
+                    <a:xfrm>
+                      <a:off x="0" y="0"/>
+                      <a:ext cx="2629267" cy="800212"/>
+                    </a:xfrm>
+                    <a:prstGeom prst="rect">
+                      <a:avLst/>
+                    </a:prstGeom>
+                  </pic:spPr>
+                </pic:pic>
+              </a:graphicData>
+            </a:graphic>
+          </wp:inline>
+        </w:drawing>
+      </w:r>
+    </w:p>
+    <w:p/>
+    <w:p/>
+    <w:p/>
+    <w:p>
+      <w:pPr>
+        <w:pStyle w:val="ListParagraph"/>
+      </w:pPr>
+      <w:r>
+        <w:lastRenderedPageBreak/>
+        <w:t xml:space="preserve">Revenue from each age group: </w:t>
+      </w:r>
+      <w:r>
+        <w:rPr>
+          <w:b w:val="0"/>
+          <w:bCs w:val="0"/>
+        </w:rPr>
+        <w:t>Evaluating the revenue impact from each age group</w:t>
+      </w:r>
+      <w:r>
+        <w:t>.</w:t>
+      </w:r>
+    </w:p>
+    <w:p>
+      <w:pPr>
+        <w:pStyle w:val="ListParagraph"/>
+        <w:numPr>
+          <w:ilvl w:val="0"/>
+          <w:numId w:val="0"/>
+        </w:numPr>
+        <w:ind w:left="1440"/>
+      </w:pPr>
+      <w:r>
+        <w:rPr>
+          <w:noProof/>
+        </w:rPr>
+        <w:drawing>
+          <wp:inline distT="0" distB="0" distL="0" distR="0" wp14:anchorId="16516985" wp14:editId="4C49D541">
+            <wp:extent cx="2162477" cy="1276528"/>
+            <wp:effectExtent l="0" t="0" r="9525" b="0"/>
+            <wp:docPr id="1694028204" name="Picture 1"/>
+            <wp:cNvGraphicFramePr>
+              <a:graphicFrameLocks xmlns:a="http://schemas.openxmlformats.org/drawingml/2006/main" noChangeAspect="1"/>
+            </wp:cNvGraphicFramePr>
+            <a:graphic xmlns:a="http://schemas.openxmlformats.org/drawingml/2006/main">
+              <a:graphicData uri="http://schemas.openxmlformats.org/drawingml/2006/picture">
+                <pic:pic xmlns:pic="http://schemas.openxmlformats.org/drawingml/2006/picture">
+                  <pic:nvPicPr>
+                    <pic:cNvPr id="1694028204" name=""/>
+                    <pic:cNvPicPr/>
+                  </pic:nvPicPr>
+                  <pic:blipFill>
+                    <a:blip r:embed="rId21"/>
+                    <a:stretch>
+                      <a:fillRect/>
+                    </a:stretch>
+                  </pic:blipFill>
+                  <pic:spPr>
+                    <a:xfrm>
+                      <a:off x="0" y="0"/>
+                      <a:ext cx="2162477" cy="1276528"/>
+                    </a:xfrm>
+                    <a:prstGeom prst="rect">
+                      <a:avLst/>
+                    </a:prstGeom>
+                  </pic:spPr>
+                </pic:pic>
+              </a:graphicData>
+            </a:graphic>
+          </wp:inline>
+        </w:drawing>
+      </w:r>
+    </w:p>
+    <w:p>
+      <w:pPr>
+        <w:pStyle w:val="ListParagraph"/>
+        <w:numPr>
+          <w:ilvl w:val="0"/>
+          <w:numId w:val="0"/>
+        </w:numPr>
+        <w:ind w:left="1440"/>
+      </w:pPr>
+    </w:p>
+    <w:p>
+      <w:r>
+        <w:pict w14:anchorId="7D86E051">
+          <v:rect id="_x0000_i1030" style="width:0;height:1.5pt" o:hralign="center" o:hrstd="t" o:hr="t" fillcolor="#a0a0a0" stroked="f"/>
+        </w:pict>
+      </w:r>
+    </w:p>
+    <w:p>
+      <w:pPr>
+        <w:pStyle w:val="Heading2"/>
+      </w:pPr>
+      <w:r>
+        <w:t xml:space="preserve"> </w:t>
+      </w:r>
+      <w:r>
+        <w:t>Conclusion</w:t>
+      </w:r>
+    </w:p>
+    <w:p>
+      <w:pPr>
+        <w:pStyle w:val="ListParagraph"/>
+        <w:numPr>
+          <w:ilvl w:val="0"/>
+          <w:numId w:val="8"/>
+        </w:numPr>
+        <w:rPr>
+          <w:b w:val="0"/>
+          <w:bCs w:val="0"/>
+        </w:rPr>
+      </w:pPr>
+      <w:r>
+        <w:rPr>
+          <w:b w:val="0"/>
+          <w:bCs w:val="0"/>
+        </w:rPr>
+        <w:t xml:space="preserve">Customer behavior varies across age, gender, spending, and purchase frequency. </w:t>
+      </w:r>
+    </w:p>
+    <w:p>
+      <w:pPr>
+        <w:pStyle w:val="ListParagraph"/>
+        <w:numPr>
+          <w:ilvl w:val="0"/>
+          <w:numId w:val="8"/>
+        </w:numPr>
+        <w:rPr>
+          <w:b w:val="0"/>
+          <w:bCs w:val="0"/>
+        </w:rPr>
+      </w:pPr>
+      <w:r>
+        <w:rPr>
+          <w:b w:val="0"/>
+          <w:bCs w:val="0"/>
+        </w:rPr>
+        <w:t xml:space="preserve">Discounts play an important role in influencing purchasing behavior, including among high-spending customers. </w:t>
+      </w:r>
+    </w:p>
+    <w:p>
+      <w:pPr>
+        <w:pStyle w:val="ListParagraph"/>
+        <w:numPr>
+          <w:ilvl w:val="0"/>
+          <w:numId w:val="8"/>
+        </w:numPr>
+        <w:rPr>
+          <w:b w:val="0"/>
+          <w:bCs w:val="0"/>
+        </w:rPr>
+      </w:pPr>
+      <w:r>
+        <w:rPr>
+          <w:b w:val="0"/>
+          <w:bCs w:val="0"/>
+        </w:rPr>
+        <w:t xml:space="preserve">Returning and loyal customers are valuable segments for customer retention and targeted marketing. </w:t>
+      </w:r>
+    </w:p>
+    <w:p>
+      <w:pPr>
+        <w:pStyle w:val="ListParagraph"/>
+        <w:numPr>
+          <w:ilvl w:val="0"/>
+          <w:numId w:val="8"/>
+        </w:numPr>
+        <w:rPr>
+          <w:b w:val="0"/>
+          <w:bCs w:val="0"/>
+        </w:rPr>
+      </w:pPr>
+      <w:r>
+        <w:rPr>
+          <w:b w:val="0"/>
+          <w:bCs w:val="0"/>
+        </w:rPr>
+        <w:t xml:space="preserve">Analysis of top-selling and highly rated products helps identify customer preferences and product demand. </w:t>
+      </w:r>
+    </w:p>
+    <w:p>
+      <w:pPr>
+        <w:pStyle w:val="ListParagraph"/>
+        <w:numPr>
+          <w:ilvl w:val="0"/>
+          <w:numId w:val="8"/>
+        </w:numPr>
+        <w:rPr>
+          <w:b w:val="0"/>
+          <w:bCs w:val="0"/>
+        </w:rPr>
+      </w:pPr>
+      <w:r>
+        <w:rPr>
+          <w:b w:val="0"/>
+          <w:bCs w:val="0"/>
+        </w:rPr>
+        <w:t xml:space="preserve">Purchase frequency can be used to develop timely and personalized repurchase reminders. </w:t>
+      </w:r>
+    </w:p>
+    <w:p>
+      <w:pPr>
+        <w:pStyle w:val="ListParagraph"/>
+        <w:numPr>
+          <w:ilvl w:val="0"/>
+          <w:numId w:val="8"/>
+        </w:numPr>
+        <w:rPr>
+          <w:b w:val="0"/>
+          <w:bCs w:val="0"/>
+        </w:rPr>
+      </w:pPr>
+      <w:r>
+        <w:rPr>
+          <w:b w:val="0"/>
+          <w:bCs w:val="0"/>
+        </w:rPr>
+        <w:t xml:space="preserve">Repeat buyers provide a potential opportunity for subscription-focused marketing strategies. </w:t>
+      </w:r>
+    </w:p>
+    <w:p>
+      <w:pPr>
+        <w:pStyle w:val="ListParagraph"/>
+        <w:numPr>
+          <w:ilvl w:val="0"/>
+          <w:numId w:val="8"/>
+        </w:numPr>
+        <w:rPr>
+          <w:b w:val="0"/>
+          <w:bCs w:val="0"/>
+        </w:rPr>
+      </w:pPr>
+      <w:r>
+        <w:rPr>
+          <w:b w:val="0"/>
+          <w:bCs w:val="0"/>
+        </w:rPr>
+        <w:t xml:space="preserve">Overall, the findings support a data-driven and targeted approach to customer engagement and retention. </w:t>
+      </w:r>
+    </w:p>
+    <w:p>
+      <w:pPr>
+        <w:pStyle w:val="Heading2"/>
+        <w:rPr>
+          <w:sz w:val="24"/>
+        </w:rPr>
+      </w:pPr>
+      <w:r>
+        <w:rPr>
           <w:bCs/>
         </w:rPr>
-        <w:t>Discount Strategy Optimization:</w:t>
-      </w:r>
-      <w:r>
-        <w:t xml:space="preserve"> Evaluate the impact of discounts on overall revenue across category types, as discount reliance varies across customer demographics.</w:t>
-      </w:r>
-    </w:p>
-    <w:p/>
+        <w:br w:type="page"/>
+      </w:r>
+      <w:r>
+        <w:lastRenderedPageBreak/>
+        <w:t>Business Recommendations</w:t>
+      </w:r>
+    </w:p>
+    <w:p>
+      <w:pPr>
+        <w:pStyle w:val="ListParagraph"/>
+        <w:numPr>
+          <w:ilvl w:val="0"/>
+          <w:numId w:val="12"/>
+        </w:numPr>
+        <w:rPr>
+          <w:b w:val="0"/>
+          <w:bCs w:val="0"/>
+        </w:rPr>
+      </w:pPr>
+      <w:r>
+        <w:rPr>
+          <w:b w:val="0"/>
+          <w:bCs w:val="0"/>
+        </w:rPr>
+        <w:t>Implement targeted marketing campaigns based on customer age groups and purchasing behavior.</w:t>
+      </w:r>
+    </w:p>
+    <w:p>
+      <w:pPr>
+        <w:pStyle w:val="ListParagraph"/>
+        <w:numPr>
+          <w:ilvl w:val="0"/>
+          <w:numId w:val="12"/>
+        </w:numPr>
+        <w:rPr>
+          <w:b w:val="0"/>
+          <w:bCs w:val="0"/>
+        </w:rPr>
+      </w:pPr>
+      <w:r>
+        <w:rPr>
+          <w:b w:val="0"/>
+          <w:bCs w:val="0"/>
+        </w:rPr>
+        <w:t>Use personalized promotions for new, returning, and loyal customers.</w:t>
+      </w:r>
+    </w:p>
+    <w:p>
+      <w:pPr>
+        <w:pStyle w:val="ListParagraph"/>
+        <w:numPr>
+          <w:ilvl w:val="0"/>
+          <w:numId w:val="12"/>
+        </w:numPr>
+        <w:rPr>
+          <w:b w:val="0"/>
+          <w:bCs w:val="0"/>
+        </w:rPr>
+      </w:pPr>
+      <w:r>
+        <w:rPr>
+          <w:b w:val="0"/>
+          <w:bCs w:val="0"/>
+        </w:rPr>
+        <w:t>Introduce automated purchase reminders based on customers’ purchase frequency.</w:t>
+      </w:r>
+    </w:p>
+    <w:p>
+      <w:pPr>
+        <w:pStyle w:val="ListParagraph"/>
+        <w:numPr>
+          <w:ilvl w:val="0"/>
+          <w:numId w:val="12"/>
+        </w:numPr>
+        <w:rPr>
+          <w:b w:val="0"/>
+          <w:bCs w:val="0"/>
+        </w:rPr>
+      </w:pPr>
+      <w:r>
+        <w:rPr>
+          <w:b w:val="0"/>
+          <w:bCs w:val="0"/>
+        </w:rPr>
+        <w:t>Optimize discount strategies by identifying products and customer segments that respond strongly to discounts.</w:t>
+      </w:r>
+    </w:p>
+    <w:p>
+      <w:pPr>
+        <w:pStyle w:val="ListParagraph"/>
+        <w:numPr>
+          <w:ilvl w:val="0"/>
+          <w:numId w:val="12"/>
+        </w:numPr>
+        <w:rPr>
+          <w:b w:val="0"/>
+          <w:bCs w:val="0"/>
+        </w:rPr>
+      </w:pPr>
+      <w:r>
+        <w:rPr>
+          <w:b w:val="0"/>
+          <w:bCs w:val="0"/>
+        </w:rPr>
+        <w:t>Promote highly rated and popular products to increase customer engagement and sales.</w:t>
+      </w:r>
+    </w:p>
+    <w:p>
+      <w:pPr>
+        <w:pStyle w:val="ListParagraph"/>
+        <w:numPr>
+          <w:ilvl w:val="0"/>
+          <w:numId w:val="12"/>
+        </w:numPr>
+        <w:rPr>
+          <w:b w:val="0"/>
+          <w:bCs w:val="0"/>
+        </w:rPr>
+      </w:pPr>
+      <w:r>
+        <w:rPr>
+          <w:b w:val="0"/>
+          <w:bCs w:val="0"/>
+        </w:rPr>
+        <w:t>Develop subscription and loyalty offers specifically for repeat customers.</w:t>
+      </w:r>
+    </w:p>
+    <w:p>
+      <w:pPr>
+        <w:pStyle w:val="ListParagraph"/>
+        <w:numPr>
+          <w:ilvl w:val="0"/>
+          <w:numId w:val="12"/>
+        </w:numPr>
+        <w:rPr>
+          <w:b w:val="0"/>
+          <w:bCs w:val="0"/>
+        </w:rPr>
+      </w:pPr>
+      <w:r>
+        <w:rPr>
+          <w:b w:val="0"/>
+          <w:bCs w:val="0"/>
+        </w:rPr>
+        <w:t>Continuously analyze customer behavior to support data-driven marketing and retention strategies.</w:t>
+      </w:r>
+    </w:p>
     <w:sectPr>
       <w:pgSz w:w="12240" w:h="15840"/>
       <w:pgMar w:top="1440" w:right="1440" w:bottom="1440" w:left="1440" w:header="720" w:footer="720" w:gutter="0"/>
@@ -1550,7 +2065,7 @@
   <w:abstractNum w:abstractNumId="0" w15:restartNumberingAfterBreak="0">
     <w:nsid w:val="014740CC"/>
     <w:multiLevelType w:val="multilevel"/>
-    <w:tmpl w:val="041E4FE2"/>
+    <w:tmpl w:val="CD247686"/>
     <w:lvl w:ilvl="0">
       <w:start w:val="1"/>
       <w:numFmt w:val="bullet"/>
@@ -1567,20 +2082,19 @@
         <w:sz w:val="20"/>
       </w:rPr>
     </w:lvl>
-    <w:lvl w:ilvl="1" w:tentative="1">
-      <w:start w:val="1"/>
-      <w:numFmt w:val="bullet"/>
-      <w:lvlText w:val="o"/>
-      <w:lvlJc w:val="left"/>
-      <w:pPr>
-        <w:tabs>
-          <w:tab w:val="num" w:pos="1440"/>
-        </w:tabs>
+    <w:lvl w:ilvl="1">
+      <w:start w:val="1"/>
+      <w:numFmt w:val="decimal"/>
+      <w:pStyle w:val="ListParagraph"/>
+      <w:lvlText w:val="%2."/>
+      <w:lvlJc w:val="left"/>
+      <w:pPr>
         <w:ind w:left="1440" w:hanging="360"/>
       </w:pPr>
       <w:rPr>
-        <w:rFonts w:ascii="Courier New" w:hAnsi="Courier New" w:hint="default"/>
-        <w:sz w:val="20"/>
+        <w:rFonts w:hint="default"/>
+        <w:b/>
+        <w:bCs/>
       </w:rPr>
     </w:lvl>
     <w:lvl w:ilvl="2" w:tentative="1">
@@ -1703,6 +2217,7 @@
     <w:lvl w:ilvl="0">
       <w:start w:val="1"/>
       <w:numFmt w:val="decimal"/>
+      <w:pStyle w:val="Heading1"/>
       <w:lvlText w:val="%1"/>
       <w:lvlJc w:val="left"/>
       <w:pPr>
@@ -1722,6 +2237,102 @@
     <w:lvl w:ilvl="2">
       <w:start w:val="1"/>
       <w:numFmt w:val="decimal"/>
+      <w:pStyle w:val="Heading3"/>
+      <w:lvlText w:val="%1.%2.%3"/>
+      <w:lvlJc w:val="left"/>
+      <w:pPr>
+        <w:ind w:left="720" w:hanging="720"/>
+      </w:pPr>
+    </w:lvl>
+    <w:lvl w:ilvl="3">
+      <w:start w:val="1"/>
+      <w:numFmt w:val="decimal"/>
+      <w:pStyle w:val="Heading4"/>
+      <w:lvlText w:val="%1.%2.%3.%4"/>
+      <w:lvlJc w:val="left"/>
+      <w:pPr>
+        <w:ind w:left="864" w:hanging="864"/>
+      </w:pPr>
+    </w:lvl>
+    <w:lvl w:ilvl="4">
+      <w:start w:val="1"/>
+      <w:numFmt w:val="decimal"/>
+      <w:pStyle w:val="Heading5"/>
+      <w:lvlText w:val="%1.%2.%3.%4.%5"/>
+      <w:lvlJc w:val="left"/>
+      <w:pPr>
+        <w:ind w:left="1008" w:hanging="1008"/>
+      </w:pPr>
+    </w:lvl>
+    <w:lvl w:ilvl="5">
+      <w:start w:val="1"/>
+      <w:numFmt w:val="decimal"/>
+      <w:pStyle w:val="Heading6"/>
+      <w:lvlText w:val="%1.%2.%3.%4.%5.%6"/>
+      <w:lvlJc w:val="left"/>
+      <w:pPr>
+        <w:ind w:left="1152" w:hanging="1152"/>
+      </w:pPr>
+    </w:lvl>
+    <w:lvl w:ilvl="6">
+      <w:start w:val="1"/>
+      <w:numFmt w:val="decimal"/>
+      <w:pStyle w:val="Heading7"/>
+      <w:lvlText w:val="%1.%2.%3.%4.%5.%6.%7"/>
+      <w:lvlJc w:val="left"/>
+      <w:pPr>
+        <w:ind w:left="1296" w:hanging="1296"/>
+      </w:pPr>
+    </w:lvl>
+    <w:lvl w:ilvl="7">
+      <w:start w:val="1"/>
+      <w:numFmt w:val="decimal"/>
+      <w:pStyle w:val="Heading8"/>
+      <w:lvlText w:val="%1.%2.%3.%4.%5.%6.%7.%8"/>
+      <w:lvlJc w:val="left"/>
+      <w:pPr>
+        <w:ind w:left="1440" w:hanging="1440"/>
+      </w:pPr>
+    </w:lvl>
+    <w:lvl w:ilvl="8">
+      <w:start w:val="1"/>
+      <w:numFmt w:val="decimal"/>
+      <w:pStyle w:val="Heading9"/>
+      <w:lvlText w:val="%1.%2.%3.%4.%5.%6.%7.%8.%9"/>
+      <w:lvlJc w:val="left"/>
+      <w:pPr>
+        <w:ind w:left="1584" w:hanging="1584"/>
+      </w:pPr>
+    </w:lvl>
+  </w:abstractNum>
+  <w:abstractNum w:abstractNumId="2" w15:restartNumberingAfterBreak="0">
+    <w:nsid w:val="07921281"/>
+    <w:multiLevelType w:val="multilevel"/>
+    <w:tmpl w:val="EEF25B00"/>
+    <w:lvl w:ilvl="0">
+      <w:start w:val="1"/>
+      <w:numFmt w:val="bullet"/>
+      <w:lvlText w:val=""/>
+      <w:lvlJc w:val="left"/>
+      <w:pPr>
+        <w:ind w:left="432" w:hanging="432"/>
+      </w:pPr>
+      <w:rPr>
+        <w:rFonts w:ascii="Symbol" w:hAnsi="Symbol" w:hint="default"/>
+      </w:rPr>
+    </w:lvl>
+    <w:lvl w:ilvl="1">
+      <w:start w:val="1"/>
+      <w:numFmt w:val="decimal"/>
+      <w:lvlText w:val="%1.%2"/>
+      <w:lvlJc w:val="left"/>
+      <w:pPr>
+        <w:ind w:left="576" w:hanging="576"/>
+      </w:pPr>
+    </w:lvl>
+    <w:lvl w:ilvl="2">
+      <w:start w:val="1"/>
+      <w:numFmt w:val="decimal"/>
       <w:lvlText w:val="%1.%2.%3"/>
       <w:lvlJc w:val="left"/>
       <w:pPr>
@@ -1783,7 +2394,96 @@
       </w:pPr>
     </w:lvl>
   </w:abstractNum>
-  <w:abstractNum w:abstractNumId="2" w15:restartNumberingAfterBreak="0">
+  <w:abstractNum w:abstractNumId="3" w15:restartNumberingAfterBreak="0">
+    <w:nsid w:val="0D9A0999"/>
+    <w:multiLevelType w:val="multilevel"/>
+    <w:tmpl w:val="EEF25B00"/>
+    <w:lvl w:ilvl="0">
+      <w:start w:val="1"/>
+      <w:numFmt w:val="bullet"/>
+      <w:lvlText w:val=""/>
+      <w:lvlJc w:val="left"/>
+      <w:pPr>
+        <w:ind w:left="432" w:hanging="432"/>
+      </w:pPr>
+      <w:rPr>
+        <w:rFonts w:ascii="Symbol" w:hAnsi="Symbol" w:hint="default"/>
+      </w:rPr>
+    </w:lvl>
+    <w:lvl w:ilvl="1">
+      <w:start w:val="1"/>
+      <w:numFmt w:val="decimal"/>
+      <w:lvlText w:val="%1.%2"/>
+      <w:lvlJc w:val="left"/>
+      <w:pPr>
+        <w:ind w:left="576" w:hanging="576"/>
+      </w:pPr>
+    </w:lvl>
+    <w:lvl w:ilvl="2">
+      <w:start w:val="1"/>
+      <w:numFmt w:val="decimal"/>
+      <w:lvlText w:val="%1.%2.%3"/>
+      <w:lvlJc w:val="left"/>
+      <w:pPr>
+        <w:ind w:left="720" w:hanging="720"/>
+      </w:pPr>
+    </w:lvl>
+    <w:lvl w:ilvl="3">
+      <w:start w:val="1"/>
+      <w:numFmt w:val="decimal"/>
+      <w:lvlText w:val="%1.%2.%3.%4"/>
+      <w:lvlJc w:val="left"/>
+      <w:pPr>
+        <w:ind w:left="864" w:hanging="864"/>
+      </w:pPr>
+    </w:lvl>
+    <w:lvl w:ilvl="4">
+      <w:start w:val="1"/>
+      <w:numFmt w:val="decimal"/>
+      <w:lvlText w:val="%1.%2.%3.%4.%5"/>
+      <w:lvlJc w:val="left"/>
+      <w:pPr>
+        <w:ind w:left="1008" w:hanging="1008"/>
+      </w:pPr>
+    </w:lvl>
+    <w:lvl w:ilvl="5">
+      <w:start w:val="1"/>
+      <w:numFmt w:val="decimal"/>
+      <w:lvlText w:val="%1.%2.%3.%4.%5.%6"/>
+      <w:lvlJc w:val="left"/>
+      <w:pPr>
+        <w:ind w:left="1152" w:hanging="1152"/>
+      </w:pPr>
+    </w:lvl>
+    <w:lvl w:ilvl="6">
+      <w:start w:val="1"/>
+      <w:numFmt w:val="decimal"/>
+      <w:lvlText w:val="%1.%2.%3.%4.%5.%6.%7"/>
+      <w:lvlJc w:val="left"/>
+      <w:pPr>
+        <w:ind w:left="1296" w:hanging="1296"/>
+      </w:pPr>
+    </w:lvl>
+    <w:lvl w:ilvl="7">
+      <w:start w:val="1"/>
+      <w:numFmt w:val="decimal"/>
+      <w:lvlText w:val="%1.%2.%3.%4.%5.%6.%7.%8"/>
+      <w:lvlJc w:val="left"/>
+      <w:pPr>
+        <w:ind w:left="1440" w:hanging="1440"/>
+      </w:pPr>
+    </w:lvl>
+    <w:lvl w:ilvl="8">
+      <w:start w:val="1"/>
+      <w:numFmt w:val="decimal"/>
+      <w:lvlText w:val="%1.%2.%3.%4.%5.%6.%7.%8.%9"/>
+      <w:lvlJc w:val="left"/>
+      <w:pPr>
+        <w:ind w:left="1584" w:hanging="1584"/>
+      </w:pPr>
+    </w:lvl>
+  </w:abstractNum>
+  <w:abstractNum w:abstractNumId="4" w15:restartNumberingAfterBreak="0">
     <w:nsid w:val="2EDD17C5"/>
     <w:multiLevelType w:val="multilevel"/>
     <w:tmpl w:val="29D658BA"/>
@@ -1932,7 +2632,7 @@
       </w:rPr>
     </w:lvl>
   </w:abstractNum>
-  <w:abstractNum w:abstractNumId="3" w15:restartNumberingAfterBreak="0">
+  <w:abstractNum w:abstractNumId="5" w15:restartNumberingAfterBreak="0">
     <w:nsid w:val="33A74020"/>
     <w:multiLevelType w:val="multilevel"/>
     <w:tmpl w:val="9F74B95E"/>
@@ -2081,7 +2781,242 @@
       </w:rPr>
     </w:lvl>
   </w:abstractNum>
-  <w:abstractNum w:abstractNumId="4" w15:restartNumberingAfterBreak="0">
+  <w:abstractNum w:abstractNumId="6" w15:restartNumberingAfterBreak="0">
+    <w:nsid w:val="3C3E45D3"/>
+    <w:multiLevelType w:val="multilevel"/>
+    <w:tmpl w:val="CF7A376C"/>
+    <w:lvl w:ilvl="0">
+      <w:start w:val="1"/>
+      <w:numFmt w:val="bullet"/>
+      <w:lvlText w:val=""/>
+      <w:lvlJc w:val="left"/>
+      <w:pPr>
+        <w:tabs>
+          <w:tab w:val="num" w:pos="720"/>
+        </w:tabs>
+        <w:ind w:left="720" w:hanging="360"/>
+      </w:pPr>
+      <w:rPr>
+        <w:rFonts w:ascii="Symbol" w:hAnsi="Symbol" w:hint="default"/>
+        <w:sz w:val="20"/>
+      </w:rPr>
+    </w:lvl>
+    <w:lvl w:ilvl="1" w:tentative="1">
+      <w:start w:val="1"/>
+      <w:numFmt w:val="bullet"/>
+      <w:lvlText w:val="o"/>
+      <w:lvlJc w:val="left"/>
+      <w:pPr>
+        <w:tabs>
+          <w:tab w:val="num" w:pos="1440"/>
+        </w:tabs>
+        <w:ind w:left="1440" w:hanging="360"/>
+      </w:pPr>
+      <w:rPr>
+        <w:rFonts w:ascii="Courier New" w:hAnsi="Courier New" w:hint="default"/>
+        <w:sz w:val="20"/>
+      </w:rPr>
+    </w:lvl>
+    <w:lvl w:ilvl="2" w:tentative="1">
+      <w:start w:val="1"/>
+      <w:numFmt w:val="bullet"/>
+      <w:lvlText w:val=""/>
+      <w:lvlJc w:val="left"/>
+      <w:pPr>
+        <w:tabs>
+          <w:tab w:val="num" w:pos="2160"/>
+        </w:tabs>
+        <w:ind w:left="2160" w:hanging="360"/>
+      </w:pPr>
+      <w:rPr>
+        <w:rFonts w:ascii="Wingdings" w:hAnsi="Wingdings" w:hint="default"/>
+        <w:sz w:val="20"/>
+      </w:rPr>
+    </w:lvl>
+    <w:lvl w:ilvl="3" w:tentative="1">
+      <w:start w:val="1"/>
+      <w:numFmt w:val="bullet"/>
+      <w:lvlText w:val=""/>
+      <w:lvlJc w:val="left"/>
+      <w:pPr>
+        <w:tabs>
+          <w:tab w:val="num" w:pos="2880"/>
+        </w:tabs>
+        <w:ind w:left="2880" w:hanging="360"/>
+      </w:pPr>
+      <w:rPr>
+        <w:rFonts w:ascii="Wingdings" w:hAnsi="Wingdings" w:hint="default"/>
+        <w:sz w:val="20"/>
+      </w:rPr>
+    </w:lvl>
+    <w:lvl w:ilvl="4" w:tentative="1">
+      <w:start w:val="1"/>
+      <w:numFmt w:val="bullet"/>
+      <w:lvlText w:val=""/>
+      <w:lvlJc w:val="left"/>
+      <w:pPr>
+        <w:tabs>
+          <w:tab w:val="num" w:pos="3600"/>
+        </w:tabs>
+        <w:ind w:left="3600" w:hanging="360"/>
+      </w:pPr>
+      <w:rPr>
+        <w:rFonts w:ascii="Wingdings" w:hAnsi="Wingdings" w:hint="default"/>
+        <w:sz w:val="20"/>
+      </w:rPr>
+    </w:lvl>
+    <w:lvl w:ilvl="5" w:tentative="1">
+      <w:start w:val="1"/>
+      <w:numFmt w:val="bullet"/>
+      <w:lvlText w:val=""/>
+      <w:lvlJc w:val="left"/>
+      <w:pPr>
+        <w:tabs>
+          <w:tab w:val="num" w:pos="4320"/>
+        </w:tabs>
+        <w:ind w:left="4320" w:hanging="360"/>
+      </w:pPr>
+      <w:rPr>
+        <w:rFonts w:ascii="Wingdings" w:hAnsi="Wingdings" w:hint="default"/>
+        <w:sz w:val="20"/>
+      </w:rPr>
+    </w:lvl>
+    <w:lvl w:ilvl="6" w:tentative="1">
+      <w:start w:val="1"/>
+      <w:numFmt w:val="bullet"/>
+      <w:lvlText w:val=""/>
+      <w:lvlJc w:val="left"/>
+      <w:pPr>
+        <w:tabs>
+          <w:tab w:val="num" w:pos="5040"/>
+        </w:tabs>
+        <w:ind w:left="5040" w:hanging="360"/>
+      </w:pPr>
+      <w:rPr>
+        <w:rFonts w:ascii="Wingdings" w:hAnsi="Wingdings" w:hint="default"/>
+        <w:sz w:val="20"/>
+      </w:rPr>
+    </w:lvl>
+    <w:lvl w:ilvl="7" w:tentative="1">
+      <w:start w:val="1"/>
+      <w:numFmt w:val="bullet"/>
+      <w:lvlText w:val=""/>
+      <w:lvlJc w:val="left"/>
+      <w:pPr>
+        <w:tabs>
+          <w:tab w:val="num" w:pos="5760"/>
+        </w:tabs>
+        <w:ind w:left="5760" w:hanging="360"/>
+      </w:pPr>
+      <w:rPr>
+        <w:rFonts w:ascii="Wingdings" w:hAnsi="Wingdings" w:hint="default"/>
+        <w:sz w:val="20"/>
+      </w:rPr>
+    </w:lvl>
+    <w:lvl w:ilvl="8" w:tentative="1">
+      <w:start w:val="1"/>
+      <w:numFmt w:val="bullet"/>
+      <w:lvlText w:val=""/>
+      <w:lvlJc w:val="left"/>
+      <w:pPr>
+        <w:tabs>
+          <w:tab w:val="num" w:pos="6480"/>
+        </w:tabs>
+        <w:ind w:left="6480" w:hanging="360"/>
+      </w:pPr>
+      <w:rPr>
+        <w:rFonts w:ascii="Wingdings" w:hAnsi="Wingdings" w:hint="default"/>
+        <w:sz w:val="20"/>
+      </w:rPr>
+    </w:lvl>
+  </w:abstractNum>
+  <w:abstractNum w:abstractNumId="7" w15:restartNumberingAfterBreak="0">
+    <w:nsid w:val="3F7D516E"/>
+    <w:multiLevelType w:val="hybridMultilevel"/>
+    <w:tmpl w:val="716EF1A4"/>
+    <w:lvl w:ilvl="0" w:tplc="0409000F">
+      <w:start w:val="1"/>
+      <w:numFmt w:val="decimal"/>
+      <w:lvlText w:val="%1."/>
+      <w:lvlJc w:val="left"/>
+      <w:pPr>
+        <w:ind w:left="720" w:hanging="360"/>
+      </w:pPr>
+    </w:lvl>
+    <w:lvl w:ilvl="1" w:tplc="04090019" w:tentative="1">
+      <w:start w:val="1"/>
+      <w:numFmt w:val="lowerLetter"/>
+      <w:lvlText w:val="%2."/>
+      <w:lvlJc w:val="left"/>
+      <w:pPr>
+        <w:ind w:left="1440" w:hanging="360"/>
+      </w:pPr>
+    </w:lvl>
+    <w:lvl w:ilvl="2" w:tplc="0409001B" w:tentative="1">
+      <w:start w:val="1"/>
+      <w:numFmt w:val="lowerRoman"/>
+      <w:lvlText w:val="%3."/>
+      <w:lvlJc w:val="right"/>
+      <w:pPr>
+        <w:ind w:left="2160" w:hanging="180"/>
+      </w:pPr>
+    </w:lvl>
+    <w:lvl w:ilvl="3" w:tplc="0409000F" w:tentative="1">
+      <w:start w:val="1"/>
+      <w:numFmt w:val="decimal"/>
+      <w:lvlText w:val="%4."/>
+      <w:lvlJc w:val="left"/>
+      <w:pPr>
+        <w:ind w:left="2880" w:hanging="360"/>
+      </w:pPr>
+    </w:lvl>
+    <w:lvl w:ilvl="4" w:tplc="04090019" w:tentative="1">
+      <w:start w:val="1"/>
+      <w:numFmt w:val="lowerLetter"/>
+      <w:lvlText w:val="%5."/>
+      <w:lvlJc w:val="left"/>
+      <w:pPr>
+        <w:ind w:left="3600" w:hanging="360"/>
+      </w:pPr>
+    </w:lvl>
+    <w:lvl w:ilvl="5" w:tplc="0409001B" w:tentative="1">
+      <w:start w:val="1"/>
+      <w:numFmt w:val="lowerRoman"/>
+      <w:lvlText w:val="%6."/>
+      <w:lvlJc w:val="right"/>
+      <w:pPr>
+        <w:ind w:left="4320" w:hanging="180"/>
+      </w:pPr>
+    </w:lvl>
+    <w:lvl w:ilvl="6" w:tplc="0409000F" w:tentative="1">
+      <w:start w:val="1"/>
+      <w:numFmt w:val="decimal"/>
+      <w:lvlText w:val="%7."/>
+      <w:lvlJc w:val="left"/>
+      <w:pPr>
+        <w:ind w:left="5040" w:hanging="360"/>
+      </w:pPr>
+    </w:lvl>
+    <w:lvl w:ilvl="7" w:tplc="04090019" w:tentative="1">
+      <w:start w:val="1"/>
+      <w:numFmt w:val="lowerLetter"/>
+      <w:lvlText w:val="%8."/>
+      <w:lvlJc w:val="left"/>
+      <w:pPr>
+        <w:ind w:left="5760" w:hanging="360"/>
+      </w:pPr>
+    </w:lvl>
+    <w:lvl w:ilvl="8" w:tplc="0409001B" w:tentative="1">
+      <w:start w:val="1"/>
+      <w:numFmt w:val="lowerRoman"/>
+      <w:lvlText w:val="%9."/>
+      <w:lvlJc w:val="right"/>
+      <w:pPr>
+        <w:ind w:left="6480" w:hanging="180"/>
+      </w:pPr>
+    </w:lvl>
+  </w:abstractNum>
+  <w:abstractNum w:abstractNumId="8" w15:restartNumberingAfterBreak="0">
     <w:nsid w:val="4D5B683D"/>
     <w:multiLevelType w:val="multilevel"/>
     <w:tmpl w:val="7E864A28"/>
@@ -2230,7 +3165,7 @@
       </w:rPr>
     </w:lvl>
   </w:abstractNum>
-  <w:abstractNum w:abstractNumId="5" w15:restartNumberingAfterBreak="0">
+  <w:abstractNum w:abstractNumId="9" w15:restartNumberingAfterBreak="0">
     <w:nsid w:val="553C38E0"/>
     <w:multiLevelType w:val="multilevel"/>
     <w:tmpl w:val="51DAA760"/>
@@ -2376,6 +3311,119 @@
       <w:rPr>
         <w:rFonts w:ascii="Wingdings" w:hAnsi="Wingdings" w:hint="default"/>
         <w:sz w:val="20"/>
+      </w:rPr>
+    </w:lvl>
+  </w:abstractNum>
+  <w:abstractNum w:abstractNumId="10" w15:restartNumberingAfterBreak="0">
+    <w:nsid w:val="68B2484F"/>
+    <w:multiLevelType w:val="hybridMultilevel"/>
+    <w:tmpl w:val="8084CD76"/>
+    <w:lvl w:ilvl="0" w:tplc="04090001">
+      <w:start w:val="1"/>
+      <w:numFmt w:val="bullet"/>
+      <w:lvlText w:val=""/>
+      <w:lvlJc w:val="left"/>
+      <w:pPr>
+        <w:ind w:left="720" w:hanging="360"/>
+      </w:pPr>
+      <w:rPr>
+        <w:rFonts w:ascii="Symbol" w:hAnsi="Symbol" w:hint="default"/>
+      </w:rPr>
+    </w:lvl>
+    <w:lvl w:ilvl="1" w:tplc="04090003" w:tentative="1">
+      <w:start w:val="1"/>
+      <w:numFmt w:val="bullet"/>
+      <w:lvlText w:val="o"/>
+      <w:lvlJc w:val="left"/>
+      <w:pPr>
+        <w:ind w:left="1440" w:hanging="360"/>
+      </w:pPr>
+      <w:rPr>
+        <w:rFonts w:ascii="Courier New" w:hAnsi="Courier New" w:cs="Courier New" w:hint="default"/>
+      </w:rPr>
+    </w:lvl>
+    <w:lvl w:ilvl="2" w:tplc="04090005" w:tentative="1">
+      <w:start w:val="1"/>
+      <w:numFmt w:val="bullet"/>
+      <w:lvlText w:val=""/>
+      <w:lvlJc w:val="left"/>
+      <w:pPr>
+        <w:ind w:left="2160" w:hanging="360"/>
+      </w:pPr>
+      <w:rPr>
+        <w:rFonts w:ascii="Wingdings" w:hAnsi="Wingdings" w:hint="default"/>
+      </w:rPr>
+    </w:lvl>
+    <w:lvl w:ilvl="3" w:tplc="04090001" w:tentative="1">
+      <w:start w:val="1"/>
+      <w:numFmt w:val="bullet"/>
+      <w:lvlText w:val=""/>
+      <w:lvlJc w:val="left"/>
+      <w:pPr>
+        <w:ind w:left="2880" w:hanging="360"/>
+      </w:pPr>
+      <w:rPr>
+        <w:rFonts w:ascii="Symbol" w:hAnsi="Symbol" w:hint="default"/>
+      </w:rPr>
+    </w:lvl>
+    <w:lvl w:ilvl="4" w:tplc="04090003" w:tentative="1">
+      <w:start w:val="1"/>
+      <w:numFmt w:val="bullet"/>
+      <w:lvlText w:val="o"/>
+      <w:lvlJc w:val="left"/>
+      <w:pPr>
+        <w:ind w:left="3600" w:hanging="360"/>
+      </w:pPr>
+      <w:rPr>
+        <w:rFonts w:ascii="Courier New" w:hAnsi="Courier New" w:cs="Courier New" w:hint="default"/>
+      </w:rPr>
+    </w:lvl>
+    <w:lvl w:ilvl="5" w:tplc="04090005" w:tentative="1">
+      <w:start w:val="1"/>
+      <w:numFmt w:val="bullet"/>
+      <w:lvlText w:val=""/>
+      <w:lvlJc w:val="left"/>
+      <w:pPr>
+        <w:ind w:left="4320" w:hanging="360"/>
+      </w:pPr>
+      <w:rPr>
+        <w:rFonts w:ascii="Wingdings" w:hAnsi="Wingdings" w:hint="default"/>
+      </w:rPr>
+    </w:lvl>
+    <w:lvl w:ilvl="6" w:tplc="04090001" w:tentative="1">
+      <w:start w:val="1"/>
+      <w:numFmt w:val="bullet"/>
+      <w:lvlText w:val=""/>
+      <w:lvlJc w:val="left"/>
+      <w:pPr>
+        <w:ind w:left="5040" w:hanging="360"/>
+      </w:pPr>
+      <w:rPr>
+        <w:rFonts w:ascii="Symbol" w:hAnsi="Symbol" w:hint="default"/>
+      </w:rPr>
+    </w:lvl>
+    <w:lvl w:ilvl="7" w:tplc="04090003" w:tentative="1">
+      <w:start w:val="1"/>
+      <w:numFmt w:val="bullet"/>
+      <w:lvlText w:val="o"/>
+      <w:lvlJc w:val="left"/>
+      <w:pPr>
+        <w:ind w:left="5760" w:hanging="360"/>
+      </w:pPr>
+      <w:rPr>
+        <w:rFonts w:ascii="Courier New" w:hAnsi="Courier New" w:cs="Courier New" w:hint="default"/>
+      </w:rPr>
+    </w:lvl>
+    <w:lvl w:ilvl="8" w:tplc="04090005" w:tentative="1">
+      <w:start w:val="1"/>
+      <w:numFmt w:val="bullet"/>
+      <w:lvlText w:val=""/>
+      <w:lvlJc w:val="left"/>
+      <w:pPr>
+        <w:ind w:left="6480" w:hanging="360"/>
+      </w:pPr>
+      <w:rPr>
+        <w:rFonts w:ascii="Wingdings" w:hAnsi="Wingdings" w:hint="default"/>
       </w:rPr>
     </w:lvl>
   </w:abstractNum>
@@ -2386,16 +3434,40 @@
     <w:abstractNumId w:val="0"/>
   </w:num>
   <w:num w:numId="3" w16cid:durableId="923688090">
+    <w:abstractNumId w:val="8"/>
+  </w:num>
+  <w:num w:numId="4" w16cid:durableId="1573731946">
+    <w:abstractNumId w:val="5"/>
+  </w:num>
+  <w:num w:numId="5" w16cid:durableId="342514902">
     <w:abstractNumId w:val="4"/>
   </w:num>
-  <w:num w:numId="4" w16cid:durableId="1573731946">
+  <w:num w:numId="6" w16cid:durableId="1315909075">
+    <w:abstractNumId w:val="9"/>
+  </w:num>
+  <w:num w:numId="7" w16cid:durableId="1387416754">
+    <w:abstractNumId w:val="6"/>
+  </w:num>
+  <w:num w:numId="8" w16cid:durableId="964234479">
+    <w:abstractNumId w:val="10"/>
+  </w:num>
+  <w:num w:numId="9" w16cid:durableId="1965312043">
+    <w:abstractNumId w:val="0"/>
+    <w:lvlOverride w:ilvl="0">
+      <w:startOverride w:val="1"/>
+    </w:lvlOverride>
+    <w:lvlOverride w:ilvl="1">
+      <w:startOverride w:val="7"/>
+    </w:lvlOverride>
+  </w:num>
+  <w:num w:numId="10" w16cid:durableId="1814371554">
+    <w:abstractNumId w:val="7"/>
+  </w:num>
+  <w:num w:numId="11" w16cid:durableId="1482387302">
     <w:abstractNumId w:val="3"/>
   </w:num>
-  <w:num w:numId="5" w16cid:durableId="342514902">
+  <w:num w:numId="12" w16cid:durableId="1424064110">
     <w:abstractNumId w:val="2"/>
-  </w:num>
-  <w:num w:numId="6" w16cid:durableId="1315909075">
-    <w:abstractNumId w:val="5"/>
   </w:num>
 </w:numbering>
 </file>
@@ -2819,8 +3891,11 @@
     <w:autoRedefine/>
     <w:uiPriority w:val="9"/>
     <w:qFormat/>
-    <w:rsid w:val="00FA0BB5"/>
+    <w:rsid w:val="00EC2AA3"/>
     <w:pPr>
+      <w:numPr>
+        <w:numId w:val="1"/>
+      </w:numPr>
       <w:spacing w:before="300" w:after="150" w:line="360" w:lineRule="auto"/>
       <w:jc w:val="both"/>
       <w:outlineLvl w:val="0"/>
@@ -2876,6 +3951,10 @@
     <w:pPr>
       <w:keepNext/>
       <w:keepLines/>
+      <w:numPr>
+        <w:ilvl w:val="2"/>
+        <w:numId w:val="1"/>
+      </w:numPr>
       <w:spacing w:before="40"/>
       <w:ind w:right="797"/>
       <w:outlineLvl w:val="2"/>
@@ -2901,6 +3980,10 @@
     <w:pPr>
       <w:keepNext/>
       <w:keepLines/>
+      <w:numPr>
+        <w:ilvl w:val="3"/>
+        <w:numId w:val="1"/>
+      </w:numPr>
       <w:spacing w:before="80" w:after="40"/>
       <w:outlineLvl w:val="3"/>
     </w:pPr>
@@ -2923,6 +4006,10 @@
     <w:pPr>
       <w:keepNext/>
       <w:keepLines/>
+      <w:numPr>
+        <w:ilvl w:val="4"/>
+        <w:numId w:val="1"/>
+      </w:numPr>
       <w:spacing w:before="80" w:after="40"/>
       <w:outlineLvl w:val="4"/>
     </w:pPr>
@@ -2944,6 +4031,10 @@
     <w:pPr>
       <w:keepNext/>
       <w:keepLines/>
+      <w:numPr>
+        <w:ilvl w:val="5"/>
+        <w:numId w:val="1"/>
+      </w:numPr>
       <w:spacing w:before="40"/>
       <w:outlineLvl w:val="5"/>
     </w:pPr>
@@ -2967,6 +4058,10 @@
     <w:pPr>
       <w:keepNext/>
       <w:keepLines/>
+      <w:numPr>
+        <w:ilvl w:val="6"/>
+        <w:numId w:val="1"/>
+      </w:numPr>
       <w:spacing w:before="40"/>
       <w:outlineLvl w:val="6"/>
     </w:pPr>
@@ -2988,6 +4083,10 @@
     <w:pPr>
       <w:keepNext/>
       <w:keepLines/>
+      <w:numPr>
+        <w:ilvl w:val="7"/>
+        <w:numId w:val="1"/>
+      </w:numPr>
       <w:outlineLvl w:val="7"/>
     </w:pPr>
     <w:rPr>
@@ -3010,6 +4109,10 @@
     <w:pPr>
       <w:keepNext/>
       <w:keepLines/>
+      <w:numPr>
+        <w:ilvl w:val="8"/>
+        <w:numId w:val="1"/>
+      </w:numPr>
       <w:outlineLvl w:val="8"/>
     </w:pPr>
     <w:rPr>
@@ -3020,7 +4123,6 @@
   <w:style w:type="character" w:default="1" w:styleId="DefaultParagraphFont">
     <w:name w:val="Default Paragraph Font"/>
     <w:uiPriority w:val="1"/>
-    <w:semiHidden/>
     <w:unhideWhenUsed/>
   </w:style>
   <w:style w:type="table" w:default="1" w:styleId="TableNormal">
@@ -3049,7 +4151,7 @@
     <w:basedOn w:val="DefaultParagraphFont"/>
     <w:link w:val="Heading1"/>
     <w:uiPriority w:val="9"/>
-    <w:rsid w:val="00FA0BB5"/>
+    <w:rsid w:val="00EC2AA3"/>
     <w:rPr>
       <w:rFonts w:ascii="Arial" w:hAnsi="Arial" w:cs="Arial"/>
       <w:b/>
@@ -3107,13 +4209,19 @@
     <w:name w:val="List Paragraph"/>
     <w:autoRedefine/>
     <w:qFormat/>
-    <w:rsid w:val="00FA0BB5"/>
+    <w:rsid w:val="001D0BA6"/>
     <w:pPr>
+      <w:numPr>
+        <w:ilvl w:val="1"/>
+        <w:numId w:val="2"/>
+      </w:numPr>
       <w:spacing w:after="0" w:line="360" w:lineRule="auto"/>
       <w:jc w:val="both"/>
     </w:pPr>
     <w:rPr>
       <w:rFonts w:ascii="Arial" w:hAnsi="Arial" w:cs="Arial"/>
+      <w:b/>
+      <w:bCs/>
       <w:kern w:val="0"/>
       <w:szCs w:val="20"/>
       <w14:ligatures w14:val="none"/>

</xml_diff>